<commit_message>
Sumar el detector, la mirada y la conversación con DeepSeek
Detector (séptima pasada): YOLOS-tiny dice dónde está cada objeto; con eso se
mide distancia, velocidad y tiempo de llegada.

Mirada (octava pasada): la pantalla atiende a una sola cosa, la que está en el
centro de la imagen. Umbral del detector en 0,9 (medido: por debajo acierta
menos de 4 de cada 10), segunda opinión de las redes propias para lo dudoso,
el tema no cambia antes de 4 cuadros y el emulador dibuja un solo recuadro.
La distancia a una persona sólo se mide si se la ve entera.

DeepSeek (novena pasada): el cerebro puede conversar y consultar marca y modelo
con la API de DeepSeek (deepseek-flash) además de Gemini. DeepSeek no tiene
audio: conversa por escrito, y en el emulador escucha y habla el navegador.
Sin probar contra la API real: no había clave.

Co-Authored-By: Claude Opus 5.5 <noreply@anthropic.com>
</commit_message>
<xml_diff>
--- a/docs/Gafas MIIA - Documentación y planos.docx
+++ b/docs/Gafas MIIA - Documentación y planos.docx
@@ -587,7 +587,7 @@
                 <w:sz w:val="20"/>
                 <w:szCs w:val="20"/>
               </w:rPr>
-              <w:t xml:space="preserve">Escrito, </w:t>
+              <w:t xml:space="preserve">Escrito para dos LLM (DeepSeek y Gemini), </w:t>
             </w:r>
             <w:r>
               <w:rPr>
@@ -603,7 +603,7 @@
                 <w:sz w:val="20"/>
                 <w:szCs w:val="20"/>
               </w:rPr>
-              <w:t xml:space="preserve">: falta la clave de Gemini</w:t>
+              <w:t xml:space="preserve"> contra ninguno: falta la clave</w:t>
             </w:r>
           </w:p>
         </w:tc>
@@ -634,7 +634,7 @@
                 <w:sz w:val="20"/>
                 <w:szCs w:val="20"/>
               </w:rPr>
-              <w:t xml:space="preserve">Medir distancia y velocidad de vehículos</w:t>
+              <w:t xml:space="preserve">Encontrar objetos en cualquier parte de la imagen</w:t>
             </w:r>
           </w:p>
         </w:tc>
@@ -660,7 +660,64 @@
                 <w:sz w:val="20"/>
                 <w:szCs w:val="20"/>
               </w:rPr>
-              <w:t xml:space="preserve">Están las cuentas; </w:t>
+              <w:t xml:space="preserve">Detector de 80 clases: encuentra el 75 % de los objetos de las fotos de prueba</w:t>
+            </w:r>
+          </w:p>
+        </w:tc>
+      </w:tr>
+      <w:tr>
+        <w:trPr>
+          <w:tblHeader w:val="off"/>
+        </w:trPr>
+        <w:tc>
+          <w:tcPr>
+            <w:tcW w:type="dxa" w:w="3385"/>
+            <w:tcBorders>
+              <w:top w:val="single" w:color="B8C2CC" w:sz="4"/>
+              <w:left w:val="single" w:color="B8C2CC" w:sz="4"/>
+              <w:bottom w:val="single" w:color="B8C2CC" w:sz="4"/>
+              <w:right w:val="single" w:color="B8C2CC" w:sz="4"/>
+            </w:tcBorders>
+            <w:tcMar>
+              <w:top w:type="dxa" w:w="70"/>
+              <w:left w:type="dxa" w:w="110"/>
+              <w:bottom w:type="dxa" w:w="70"/>
+              <w:right w:type="dxa" w:w="110"/>
+            </w:tcMar>
+          </w:tcPr>
+          <w:p>
+            <w:r>
+              <w:rPr>
+                <w:sz w:val="20"/>
+                <w:szCs w:val="20"/>
+              </w:rPr>
+              <w:t xml:space="preserve">Medir distancia y velocidad de vehículos y personas</w:t>
+            </w:r>
+          </w:p>
+        </w:tc>
+        <w:tc>
+          <w:tcPr>
+            <w:tcW w:type="dxa" w:w="5641"/>
+            <w:tcBorders>
+              <w:top w:val="single" w:color="B8C2CC" w:sz="4"/>
+              <w:left w:val="single" w:color="B8C2CC" w:sz="4"/>
+              <w:bottom w:val="single" w:color="B8C2CC" w:sz="4"/>
+              <w:right w:val="single" w:color="B8C2CC" w:sz="4"/>
+            </w:tcBorders>
+            <w:tcMar>
+              <w:top w:type="dxa" w:w="70"/>
+              <w:left w:type="dxa" w:w="110"/>
+              <w:bottom w:type="dxa" w:w="70"/>
+              <w:right w:type="dxa" w:w="110"/>
+            </w:tcMar>
+          </w:tcPr>
+          <w:p>
+            <w:r>
+              <w:rPr>
+                <w:sz w:val="20"/>
+                <w:szCs w:val="20"/>
+              </w:rPr>
+              <w:t xml:space="preserve">Funciona con el detector. Es una estimación gruesa y </w:t>
             </w:r>
             <w:r>
               <w:rPr>
@@ -669,14 +726,7 @@
                 <w:sz w:val="20"/>
                 <w:szCs w:val="20"/>
               </w:rPr>
-              <w:t xml:space="preserve">falta el detector</w:t>
-            </w:r>
-            <w:r>
-              <w:rPr>
-                <w:sz w:val="20"/>
-                <w:szCs w:val="20"/>
-              </w:rPr>
-              <w:t xml:space="preserve"> que les dé los datos</w:t>
+              <w:t xml:space="preserve">no se probó con vehículos reales</w:t>
             </w:r>
           </w:p>
         </w:tc>
@@ -1034,7 +1084,7 @@
                 <w:sz w:val="20"/>
                 <w:szCs w:val="20"/>
               </w:rPr>
-              <w:t xml:space="preserve">Sólo dos cosas, y las dos son opcionales: la voz (Gemini Live) y la consulta de marca y modelo de un aparato (Gemini). Todo lo demás corre sin internet.</w:t>
+              <w:t xml:space="preserve">Sólo dos cosas, y las dos son opcionales: la conversación y la consulta de marca y modelo de un aparato. Las hace un LLM de afuera: DeepSeek o Gemini, el que tenga clave. Todo lo demás corre sin internet.</w:t>
             </w:r>
           </w:p>
         </w:tc>
@@ -5007,6 +5057,122 @@
                 <w:sz w:val="18"/>
                 <w:szCs w:val="18"/>
               </w:rPr>
+              <w:t xml:space="preserve">src/detector.js</w:t>
+            </w:r>
+          </w:p>
+        </w:tc>
+        <w:tc>
+          <w:tcPr>
+            <w:tcW w:type="dxa" w:w="6017"/>
+            <w:tcBorders>
+              <w:top w:val="single" w:color="B8C2CC" w:sz="4"/>
+              <w:left w:val="single" w:color="B8C2CC" w:sz="4"/>
+              <w:bottom w:val="single" w:color="B8C2CC" w:sz="4"/>
+              <w:right w:val="single" w:color="B8C2CC" w:sz="4"/>
+            </w:tcBorders>
+            <w:tcMar>
+              <w:top w:type="dxa" w:w="70"/>
+              <w:left w:type="dxa" w:w="110"/>
+              <w:bottom w:type="dxa" w:w="70"/>
+              <w:right w:type="dxa" w:w="110"/>
+            </w:tcMar>
+          </w:tcPr>
+          <w:p>
+            <w:r>
+              <w:rPr>
+                <w:sz w:val="20"/>
+                <w:szCs w:val="20"/>
+              </w:rPr>
+              <w:t xml:space="preserve">Dice dónde está cada objeto en el cuadro (YOLOS-tiny, corre en la PC)</w:t>
+            </w:r>
+          </w:p>
+        </w:tc>
+      </w:tr>
+      <w:tr>
+        <w:trPr>
+          <w:tblHeader w:val="off"/>
+        </w:trPr>
+        <w:tc>
+          <w:tcPr>
+            <w:tcW w:type="dxa" w:w="3009"/>
+            <w:tcBorders>
+              <w:top w:val="single" w:color="B8C2CC" w:sz="4"/>
+              <w:left w:val="single" w:color="B8C2CC" w:sz="4"/>
+              <w:bottom w:val="single" w:color="B8C2CC" w:sz="4"/>
+              <w:right w:val="single" w:color="B8C2CC" w:sz="4"/>
+            </w:tcBorders>
+            <w:tcMar>
+              <w:top w:type="dxa" w:w="70"/>
+              <w:left w:type="dxa" w:w="110"/>
+              <w:bottom w:type="dxa" w:w="70"/>
+              <w:right w:type="dxa" w:w="110"/>
+            </w:tcMar>
+          </w:tcPr>
+          <w:p>
+            <w:r>
+              <w:rPr>
+                <w:rFonts w:ascii="Consolas" w:cs="Consolas" w:eastAsia="Consolas" w:hAnsi="Consolas"/>
+                <w:sz w:val="18"/>
+                <w:szCs w:val="18"/>
+              </w:rPr>
+              <w:t xml:space="preserve">src/seguimiento.js</w:t>
+            </w:r>
+          </w:p>
+        </w:tc>
+        <w:tc>
+          <w:tcPr>
+            <w:tcW w:type="dxa" w:w="6017"/>
+            <w:tcBorders>
+              <w:top w:val="single" w:color="B8C2CC" w:sz="4"/>
+              <w:left w:val="single" w:color="B8C2CC" w:sz="4"/>
+              <w:bottom w:val="single" w:color="B8C2CC" w:sz="4"/>
+              <w:right w:val="single" w:color="B8C2CC" w:sz="4"/>
+            </w:tcBorders>
+            <w:tcMar>
+              <w:top w:type="dxa" w:w="70"/>
+              <w:left w:type="dxa" w:w="110"/>
+              <w:bottom w:type="dxa" w:w="70"/>
+              <w:right w:type="dxa" w:w="110"/>
+            </w:tcMar>
+          </w:tcPr>
+          <w:p>
+            <w:r>
+              <w:rPr>
+                <w:sz w:val="20"/>
+                <w:szCs w:val="20"/>
+              </w:rPr>
+              <w:t xml:space="preserve">Elige el objeto principal y le mide distancia, velocidad y tiempo</w:t>
+            </w:r>
+          </w:p>
+        </w:tc>
+      </w:tr>
+      <w:tr>
+        <w:trPr>
+          <w:tblHeader w:val="off"/>
+        </w:trPr>
+        <w:tc>
+          <w:tcPr>
+            <w:tcW w:type="dxa" w:w="3009"/>
+            <w:tcBorders>
+              <w:top w:val="single" w:color="B8C2CC" w:sz="4"/>
+              <w:left w:val="single" w:color="B8C2CC" w:sz="4"/>
+              <w:bottom w:val="single" w:color="B8C2CC" w:sz="4"/>
+              <w:right w:val="single" w:color="B8C2CC" w:sz="4"/>
+            </w:tcBorders>
+            <w:tcMar>
+              <w:top w:type="dxa" w:w="70"/>
+              <w:left w:type="dxa" w:w="110"/>
+              <w:bottom w:type="dxa" w:w="70"/>
+              <w:right w:type="dxa" w:w="110"/>
+            </w:tcMar>
+          </w:tcPr>
+          <w:p>
+            <w:r>
+              <w:rPr>
+                <w:rFonts w:ascii="Consolas" w:cs="Consolas" w:eastAsia="Consolas" w:hAnsi="Consolas"/>
+                <w:sz w:val="18"/>
+                <w:szCs w:val="18"/>
+              </w:rPr>
               <w:t xml:space="preserve">src/red_objetos.js</w:t>
             </w:r>
           </w:p>
@@ -7705,6 +7871,587 @@
     </w:p>
     <w:p>
       <w:pPr>
+        <w:pStyle w:val="Heading2"/>
+        <w:keepNext/>
+      </w:pPr>
+      <w:r>
+        <w:t xml:space="preserve">El detector: dónde está cada cosa</w:t>
+      </w:r>
+    </w:p>
+    <w:p>
+      <w:pPr>
+        <w:spacing w:after="140"/>
+      </w:pPr>
+      <w:r>
+        <w:t xml:space="preserve">Las redes de arriba dicen qué es lo que llena el recuadro del centro. No sirven si el objeto está al costado, lejos o al lado de otro más grande: con un celular en la mano junto a la cara, ganaba siempre «persona». Para eso se sumó un </w:t>
+      </w:r>
+      <w:r>
+        <w:rPr>
+          <w:b/>
+          <w:bCs/>
+        </w:rPr>
+        <w:t xml:space="preserve">detector</w:t>
+      </w:r>
+      <w:r>
+        <w:t xml:space="preserve"> (YOLOS-tiny, licencia Apache 2.0, 9,7 MB), que marca un recuadro por objeto y corre en la PC en unos 130 ms por cuadro.</w:t>
+      </w:r>
+    </w:p>
+    <w:tbl>
+      <w:tblPr>
+        <w:tblW w:type="dxa" w:w="9026"/>
+        <w:tblBorders>
+          <w:top w:val="single" w:color="auto" w:sz="4"/>
+          <w:left w:val="single" w:color="auto" w:sz="4"/>
+          <w:bottom w:val="single" w:color="auto" w:sz="4"/>
+          <w:right w:val="single" w:color="auto" w:sz="4"/>
+          <w:insideH w:val="single" w:color="auto" w:sz="4"/>
+          <w:insideV w:val="single" w:color="auto" w:sz="4"/>
+        </w:tblBorders>
+      </w:tblPr>
+      <w:tblGrid>
+        <w:gridCol w:w="5158"/>
+        <w:gridCol w:w="3868"/>
+      </w:tblGrid>
+      <w:tr>
+        <w:trPr>
+          <w:tblHeader/>
+        </w:trPr>
+        <w:tc>
+          <w:tcPr>
+            <w:tcW w:type="dxa" w:w="5158"/>
+            <w:tcBorders>
+              <w:top w:val="single" w:color="B8C2CC" w:sz="4"/>
+              <w:left w:val="single" w:color="B8C2CC" w:sz="4"/>
+              <w:bottom w:val="single" w:color="B8C2CC" w:sz="4"/>
+              <w:right w:val="single" w:color="B8C2CC" w:sz="4"/>
+            </w:tcBorders>
+            <w:shd w:fill="DCE6F1" w:val="clear"/>
+            <w:tcMar>
+              <w:top w:type="dxa" w:w="70"/>
+              <w:left w:type="dxa" w:w="110"/>
+              <w:bottom w:type="dxa" w:w="70"/>
+              <w:right w:type="dxa" w:w="110"/>
+            </w:tcMar>
+          </w:tcPr>
+          <w:p>
+            <w:r>
+              <w:rPr>
+                <w:b/>
+                <w:bCs/>
+                <w:sz w:val="20"/>
+                <w:szCs w:val="20"/>
+              </w:rPr>
+              <w:t xml:space="preserve">Medido el 2 de octubre de 2026</w:t>
+            </w:r>
+          </w:p>
+        </w:tc>
+        <w:tc>
+          <w:tcPr>
+            <w:tcW w:type="dxa" w:w="3868"/>
+            <w:tcBorders>
+              <w:top w:val="single" w:color="B8C2CC" w:sz="4"/>
+              <w:left w:val="single" w:color="B8C2CC" w:sz="4"/>
+              <w:bottom w:val="single" w:color="B8C2CC" w:sz="4"/>
+              <w:right w:val="single" w:color="B8C2CC" w:sz="4"/>
+            </w:tcBorders>
+            <w:shd w:fill="DCE6F1" w:val="clear"/>
+            <w:tcMar>
+              <w:top w:type="dxa" w:w="70"/>
+              <w:left w:type="dxa" w:w="110"/>
+              <w:bottom w:type="dxa" w:w="70"/>
+              <w:right w:type="dxa" w:w="110"/>
+            </w:tcMar>
+          </w:tcPr>
+          <w:p>
+            <w:r>
+              <w:rPr>
+                <w:b/>
+                <w:bCs/>
+                <w:sz w:val="20"/>
+                <w:szCs w:val="20"/>
+              </w:rPr>
+              <w:t xml:space="preserve">Resultado</w:t>
+            </w:r>
+          </w:p>
+        </w:tc>
+      </w:tr>
+      <w:tr>
+        <w:trPr>
+          <w:tblHeader w:val="off"/>
+        </w:trPr>
+        <w:tc>
+          <w:tcPr>
+            <w:tcW w:type="dxa" w:w="5158"/>
+            <w:tcBorders>
+              <w:top w:val="single" w:color="B8C2CC" w:sz="4"/>
+              <w:left w:val="single" w:color="B8C2CC" w:sz="4"/>
+              <w:bottom w:val="single" w:color="B8C2CC" w:sz="4"/>
+              <w:right w:val="single" w:color="B8C2CC" w:sz="4"/>
+            </w:tcBorders>
+            <w:tcMar>
+              <w:top w:type="dxa" w:w="70"/>
+              <w:left w:type="dxa" w:w="110"/>
+              <w:bottom w:type="dxa" w:w="70"/>
+              <w:right w:type="dxa" w:w="110"/>
+            </w:tcMar>
+          </w:tcPr>
+          <w:p>
+            <w:r>
+              <w:rPr>
+                <w:sz w:val="20"/>
+                <w:szCs w:val="20"/>
+              </w:rPr>
+              <w:t xml:space="preserve">Objetos anotados de 14 clases que el detector encuentra (fotos de validación de COCO)</w:t>
+            </w:r>
+          </w:p>
+        </w:tc>
+        <w:tc>
+          <w:tcPr>
+            <w:tcW w:type="dxa" w:w="3868"/>
+            <w:tcBorders>
+              <w:top w:val="single" w:color="B8C2CC" w:sz="4"/>
+              <w:left w:val="single" w:color="B8C2CC" w:sz="4"/>
+              <w:bottom w:val="single" w:color="B8C2CC" w:sz="4"/>
+              <w:right w:val="single" w:color="B8C2CC" w:sz="4"/>
+            </w:tcBorders>
+            <w:tcMar>
+              <w:top w:type="dxa" w:w="70"/>
+              <w:left w:type="dxa" w:w="110"/>
+              <w:bottom w:type="dxa" w:w="70"/>
+              <w:right w:type="dxa" w:w="110"/>
+            </w:tcMar>
+          </w:tcPr>
+          <w:p>
+            <w:r>
+              <w:rPr>
+                <w:sz w:val="20"/>
+                <w:szCs w:val="20"/>
+              </w:rPr>
+              <w:t xml:space="preserve">845 de 1.124 (75 %)</w:t>
+            </w:r>
+          </w:p>
+        </w:tc>
+      </w:tr>
+      <w:tr>
+        <w:trPr>
+          <w:tblHeader w:val="off"/>
+        </w:trPr>
+        <w:tc>
+          <w:tcPr>
+            <w:tcW w:type="dxa" w:w="5158"/>
+            <w:tcBorders>
+              <w:top w:val="single" w:color="B8C2CC" w:sz="4"/>
+              <w:left w:val="single" w:color="B8C2CC" w:sz="4"/>
+              <w:bottom w:val="single" w:color="B8C2CC" w:sz="4"/>
+              <w:right w:val="single" w:color="B8C2CC" w:sz="4"/>
+            </w:tcBorders>
+            <w:tcMar>
+              <w:top w:type="dxa" w:w="70"/>
+              <w:left w:type="dxa" w:w="110"/>
+              <w:bottom w:type="dxa" w:w="70"/>
+              <w:right w:type="dxa" w:w="110"/>
+            </w:tcMar>
+          </w:tcPr>
+          <w:p>
+            <w:r>
+              <w:rPr>
+                <w:sz w:val="20"/>
+                <w:szCs w:val="20"/>
+              </w:rPr>
+              <w:t xml:space="preserve">Celulares</w:t>
+            </w:r>
+          </w:p>
+        </w:tc>
+        <w:tc>
+          <w:tcPr>
+            <w:tcW w:type="dxa" w:w="3868"/>
+            <w:tcBorders>
+              <w:top w:val="single" w:color="B8C2CC" w:sz="4"/>
+              <w:left w:val="single" w:color="B8C2CC" w:sz="4"/>
+              <w:bottom w:val="single" w:color="B8C2CC" w:sz="4"/>
+              <w:right w:val="single" w:color="B8C2CC" w:sz="4"/>
+            </w:tcBorders>
+            <w:tcMar>
+              <w:top w:type="dxa" w:w="70"/>
+              <w:left w:type="dxa" w:w="110"/>
+              <w:bottom w:type="dxa" w:w="70"/>
+              <w:right w:type="dxa" w:w="110"/>
+            </w:tcMar>
+          </w:tcPr>
+          <w:p>
+            <w:r>
+              <w:rPr>
+                <w:sz w:val="20"/>
+                <w:szCs w:val="20"/>
+              </w:rPr>
+              <w:t xml:space="preserve">54 de 70 (77 %)</w:t>
+            </w:r>
+          </w:p>
+        </w:tc>
+      </w:tr>
+      <w:tr>
+        <w:trPr>
+          <w:tblHeader w:val="off"/>
+        </w:trPr>
+        <w:tc>
+          <w:tcPr>
+            <w:tcW w:type="dxa" w:w="5158"/>
+            <w:tcBorders>
+              <w:top w:val="single" w:color="B8C2CC" w:sz="4"/>
+              <w:left w:val="single" w:color="B8C2CC" w:sz="4"/>
+              <w:bottom w:val="single" w:color="B8C2CC" w:sz="4"/>
+              <w:right w:val="single" w:color="B8C2CC" w:sz="4"/>
+            </w:tcBorders>
+            <w:tcMar>
+              <w:top w:type="dxa" w:w="70"/>
+              <w:left w:type="dxa" w:w="110"/>
+              <w:bottom w:type="dxa" w:w="70"/>
+              <w:right w:type="dxa" w:w="110"/>
+            </w:tcMar>
+          </w:tcPr>
+          <w:p>
+            <w:r>
+              <w:rPr>
+                <w:sz w:val="20"/>
+                <w:szCs w:val="20"/>
+              </w:rPr>
+              <w:t xml:space="preserve">De lo que marca con confianza menor a 0,9, es cierto</w:t>
+            </w:r>
+          </w:p>
+        </w:tc>
+        <w:tc>
+          <w:tcPr>
+            <w:tcW w:type="dxa" w:w="3868"/>
+            <w:tcBorders>
+              <w:top w:val="single" w:color="B8C2CC" w:sz="4"/>
+              <w:left w:val="single" w:color="B8C2CC" w:sz="4"/>
+              <w:bottom w:val="single" w:color="B8C2CC" w:sz="4"/>
+              <w:right w:val="single" w:color="B8C2CC" w:sz="4"/>
+            </w:tcBorders>
+            <w:tcMar>
+              <w:top w:type="dxa" w:w="70"/>
+              <w:left w:type="dxa" w:w="110"/>
+              <w:bottom w:type="dxa" w:w="70"/>
+              <w:right w:type="dxa" w:w="110"/>
+            </w:tcMar>
+          </w:tcPr>
+          <w:p>
+            <w:r>
+              <w:rPr>
+                <w:sz w:val="20"/>
+                <w:szCs w:val="20"/>
+              </w:rPr>
+              <w:t xml:space="preserve">menos de 4 de cada 10</w:t>
+            </w:r>
+          </w:p>
+        </w:tc>
+      </w:tr>
+      <w:tr>
+        <w:trPr>
+          <w:tblHeader w:val="off"/>
+        </w:trPr>
+        <w:tc>
+          <w:tcPr>
+            <w:tcW w:type="dxa" w:w="5158"/>
+            <w:tcBorders>
+              <w:top w:val="single" w:color="B8C2CC" w:sz="4"/>
+              <w:left w:val="single" w:color="B8C2CC" w:sz="4"/>
+              <w:bottom w:val="single" w:color="B8C2CC" w:sz="4"/>
+              <w:right w:val="single" w:color="B8C2CC" w:sz="4"/>
+            </w:tcBorders>
+            <w:tcMar>
+              <w:top w:type="dxa" w:w="70"/>
+              <w:left w:type="dxa" w:w="110"/>
+              <w:bottom w:type="dxa" w:w="70"/>
+              <w:right w:type="dxa" w:w="110"/>
+            </w:tcMar>
+          </w:tcPr>
+          <w:p>
+            <w:r>
+              <w:rPr>
+                <w:sz w:val="20"/>
+                <w:szCs w:val="20"/>
+              </w:rPr>
+              <w:t xml:space="preserve">El objeto que elige la mirada, uno por foto: es cierto</w:t>
+            </w:r>
+          </w:p>
+        </w:tc>
+        <w:tc>
+          <w:tcPr>
+            <w:tcW w:type="dxa" w:w="3868"/>
+            <w:tcBorders>
+              <w:top w:val="single" w:color="B8C2CC" w:sz="4"/>
+              <w:left w:val="single" w:color="B8C2CC" w:sz="4"/>
+              <w:bottom w:val="single" w:color="B8C2CC" w:sz="4"/>
+              <w:right w:val="single" w:color="B8C2CC" w:sz="4"/>
+            </w:tcBorders>
+            <w:tcMar>
+              <w:top w:type="dxa" w:w="70"/>
+              <w:left w:type="dxa" w:w="110"/>
+              <w:bottom w:type="dxa" w:w="70"/>
+              <w:right w:type="dxa" w:w="110"/>
+            </w:tcMar>
+          </w:tcPr>
+          <w:p>
+            <w:r>
+              <w:rPr>
+                <w:sz w:val="20"/>
+                <w:szCs w:val="20"/>
+              </w:rPr>
+              <w:t xml:space="preserve">305 de 338 (90 %)</w:t>
+            </w:r>
+          </w:p>
+        </w:tc>
+      </w:tr>
+      <w:tr>
+        <w:trPr>
+          <w:tblHeader w:val="off"/>
+        </w:trPr>
+        <w:tc>
+          <w:tcPr>
+            <w:tcW w:type="dxa" w:w="5158"/>
+            <w:tcBorders>
+              <w:top w:val="single" w:color="B8C2CC" w:sz="4"/>
+              <w:left w:val="single" w:color="B8C2CC" w:sz="4"/>
+              <w:bottom w:val="single" w:color="B8C2CC" w:sz="4"/>
+              <w:right w:val="single" w:color="B8C2CC" w:sz="4"/>
+            </w:tcBorders>
+            <w:tcMar>
+              <w:top w:type="dxa" w:w="70"/>
+              <w:left w:type="dxa" w:w="110"/>
+              <w:bottom w:type="dxa" w:w="70"/>
+              <w:right w:type="dxa" w:w="110"/>
+            </w:tcMar>
+          </w:tcPr>
+          <w:p>
+            <w:r>
+              <w:rPr>
+                <w:sz w:val="20"/>
+                <w:szCs w:val="20"/>
+              </w:rPr>
+              <w:t xml:space="preserve">Escenas con un celular: la pantalla dijo «celular»</w:t>
+            </w:r>
+          </w:p>
+        </w:tc>
+        <w:tc>
+          <w:tcPr>
+            <w:tcW w:type="dxa" w:w="3868"/>
+            <w:tcBorders>
+              <w:top w:val="single" w:color="B8C2CC" w:sz="4"/>
+              <w:left w:val="single" w:color="B8C2CC" w:sz="4"/>
+              <w:bottom w:val="single" w:color="B8C2CC" w:sz="4"/>
+              <w:right w:val="single" w:color="B8C2CC" w:sz="4"/>
+            </w:tcBorders>
+            <w:tcMar>
+              <w:top w:type="dxa" w:w="70"/>
+              <w:left w:type="dxa" w:w="110"/>
+              <w:bottom w:type="dxa" w:w="70"/>
+              <w:right w:type="dxa" w:w="110"/>
+            </w:tcMar>
+          </w:tcPr>
+          <w:p>
+            <w:r>
+              <w:rPr>
+                <w:sz w:val="20"/>
+                <w:szCs w:val="20"/>
+              </w:rPr>
+              <w:t xml:space="preserve">25 de 40</w:t>
+            </w:r>
+          </w:p>
+        </w:tc>
+      </w:tr>
+      <w:tr>
+        <w:trPr>
+          <w:tblHeader w:val="off"/>
+        </w:trPr>
+        <w:tc>
+          <w:tcPr>
+            <w:tcW w:type="dxa" w:w="5158"/>
+            <w:tcBorders>
+              <w:top w:val="single" w:color="B8C2CC" w:sz="4"/>
+              <w:left w:val="single" w:color="B8C2CC" w:sz="4"/>
+              <w:bottom w:val="single" w:color="B8C2CC" w:sz="4"/>
+              <w:right w:val="single" w:color="B8C2CC" w:sz="4"/>
+            </w:tcBorders>
+            <w:tcMar>
+              <w:top w:type="dxa" w:w="70"/>
+              <w:left w:type="dxa" w:w="110"/>
+              <w:bottom w:type="dxa" w:w="70"/>
+              <w:right w:type="dxa" w:w="110"/>
+            </w:tcMar>
+          </w:tcPr>
+          <w:p>
+            <w:r>
+              <w:rPr>
+                <w:sz w:val="20"/>
+                <w:szCs w:val="20"/>
+              </w:rPr>
+              <w:t xml:space="preserve">Escenas con una moto: la pantalla dijo «moto»</w:t>
+            </w:r>
+          </w:p>
+        </w:tc>
+        <w:tc>
+          <w:tcPr>
+            <w:tcW w:type="dxa" w:w="3868"/>
+            <w:tcBorders>
+              <w:top w:val="single" w:color="B8C2CC" w:sz="4"/>
+              <w:left w:val="single" w:color="B8C2CC" w:sz="4"/>
+              <w:bottom w:val="single" w:color="B8C2CC" w:sz="4"/>
+              <w:right w:val="single" w:color="B8C2CC" w:sz="4"/>
+            </w:tcBorders>
+            <w:tcMar>
+              <w:top w:type="dxa" w:w="70"/>
+              <w:left w:type="dxa" w:w="110"/>
+              <w:bottom w:type="dxa" w:w="70"/>
+              <w:right w:type="dxa" w:w="110"/>
+            </w:tcMar>
+          </w:tcPr>
+          <w:p>
+            <w:r>
+              <w:rPr>
+                <w:sz w:val="20"/>
+                <w:szCs w:val="20"/>
+              </w:rPr>
+              <w:t xml:space="preserve">19 de 23</w:t>
+            </w:r>
+          </w:p>
+        </w:tc>
+      </w:tr>
+    </w:tbl>
+    <w:p>
+      <w:pPr>
+        <w:spacing w:after="0"/>
+      </w:pPr>
+      <w:r>
+        <w:rPr>
+          <w:sz w:val="12"/>
+          <w:szCs w:val="12"/>
+        </w:rPr>
+        <w:t xml:space="preserve"/>
+      </w:r>
+    </w:p>
+    <w:p>
+      <w:pPr>
+        <w:pStyle w:val="ListParagraph"/>
+        <w:numPr>
+          <w:ilvl w:val="0"/>
+          <w:numId w:val="2"/>
+        </w:numPr>
+        <w:spacing w:after="80"/>
+      </w:pPr>
+      <w:r>
+        <w:rPr>
+          <w:b/>
+          <w:bCs/>
+        </w:rPr>
+        <w:t xml:space="preserve">Sólo conoce 80 clases.</w:t>
+      </w:r>
+      <w:r>
+        <w:t xml:space="preserve"> Un destornillador o una calculadora no los ve: para eso siguen las redes propias.</w:t>
+      </w:r>
+    </w:p>
+    <w:p>
+      <w:pPr>
+        <w:pStyle w:val="ListParagraph"/>
+        <w:numPr>
+          <w:ilvl w:val="0"/>
+          <w:numId w:val="2"/>
+        </w:numPr>
+        <w:spacing w:after="80"/>
+      </w:pPr>
+      <w:r>
+        <w:rPr>
+          <w:b/>
+          <w:bCs/>
+        </w:rPr>
+        <w:t xml:space="preserve">Se equivoca mucho cuando duda.</w:t>
+      </w:r>
+      <w:r>
+        <w:t xml:space="preserve"> Marca unos 12 recuadros por foto y más de la mitad no son nada. Por eso sólo cuenta lo que marca con confianza de 0,9 o más.</w:t>
+      </w:r>
+    </w:p>
+    <w:p>
+      <w:pPr>
+        <w:pStyle w:val="ListParagraph"/>
+        <w:numPr>
+          <w:ilvl w:val="0"/>
+          <w:numId w:val="2"/>
+        </w:numPr>
+        <w:spacing w:after="80"/>
+      </w:pPr>
+      <w:r>
+        <w:rPr>
+          <w:b/>
+          <w:bCs/>
+        </w:rPr>
+        <w:t xml:space="preserve">Segunda opinión.</w:t>
+      </w:r>
+      <w:r>
+        <w:t xml:space="preserve"> Lo que marca sin llegar a 0,9 no se tira: el recorte se le muestra a las redes propias, y vale sólo si ellas dicen lo mismo que el detector. Así se recupera el celular en la mano. Si no coinciden se descarta: medido, en ese caso las redes aciertan muy pocas veces.</w:t>
+      </w:r>
+    </w:p>
+    <w:p>
+      <w:pPr>
+        <w:pStyle w:val="ListParagraph"/>
+        <w:numPr>
+          <w:ilvl w:val="0"/>
+          <w:numId w:val="2"/>
+        </w:numPr>
+        <w:spacing w:after="80"/>
+      </w:pPr>
+      <w:r>
+        <w:rPr>
+          <w:b/>
+          <w:bCs/>
+        </w:rPr>
+        <w:t xml:space="preserve">De todos los objetos elige uno: el que se está mirando.</w:t>
+      </w:r>
+      <w:r>
+        <w:t xml:space="preserve"> Las gafas no ven el ojo, así que la mirada es el centro de la imagen, adonde apunta la cabeza. Lo que queda alrededor no se muestra. Si es una persona con algo en la mano, el objeto.</w:t>
+      </w:r>
+    </w:p>
+    <w:p>
+      <w:pPr>
+        <w:pStyle w:val="ListParagraph"/>
+        <w:numPr>
+          <w:ilvl w:val="0"/>
+          <w:numId w:val="2"/>
+        </w:numPr>
+        <w:spacing w:after="80"/>
+      </w:pPr>
+      <w:r>
+        <w:rPr>
+          <w:b/>
+          <w:bCs/>
+        </w:rPr>
+        <w:t xml:space="preserve">La pantalla no salta.</w:t>
+      </w:r>
+      <w:r>
+        <w:t xml:space="preserve"> No cambia de tema más de una vez cada 2 segundos, para no cansar la vista ni sacar la atención de la calle.</w:t>
+      </w:r>
+    </w:p>
+    <w:p>
+      <w:pPr>
+        <w:pStyle w:val="ListParagraph"/>
+        <w:numPr>
+          <w:ilvl w:val="0"/>
+          <w:numId w:val="2"/>
+        </w:numPr>
+        <w:spacing w:after="80"/>
+      </w:pPr>
+      <w:r>
+        <w:rPr>
+          <w:b/>
+          <w:bCs/>
+        </w:rPr>
+        <w:t xml:space="preserve">Un vehículo que viene de costado no se anuncia:</w:t>
+      </w:r>
+      <w:r>
+        <w:t xml:space="preserve"> sólo se mide lo que se mira.</w:t>
+      </w:r>
+    </w:p>
+    <w:p>
+      <w:pPr>
         <w:pBdr>
           <w:left w:val="single" w:color="D9822B" w:sz="18" w:space="8"/>
         </w:pBdr>
@@ -8486,7 +9233,7 @@
         <w:spacing w:after="140"/>
       </w:pPr>
       <w:r>
-        <w:t xml:space="preserve">Las gafas reconocen autos, motos, colectivos, camiones, bicicletas, trenes, aviones, barcos, helicópteros y topadoras. Medirles la distancia y la velocidad es otro problema, y hoy está resuelto a medias.</w:t>
+        <w:t xml:space="preserve">Las gafas reconocen autos, motos, colectivos, camiones, bicicletas, trenes, aviones, barcos, helicópteros y topadoras. Con el detector, además, les miden la distancia, la velocidad de acercamiento y el tiempo que falta para que lleguen, y lo muestran en pantalla: «A ≈ 12 m», «Se acerca ≈ 20 km/h», «Llega en ≈ 2 s». También miden la distancia a una persona.</w:t>
       </w:r>
     </w:p>
     <w:p>
@@ -8495,7 +9242,7 @@
         <w:keepNext/>
       </w:pPr>
       <w:r>
-        <w:t xml:space="preserve">Las cuentas, que ya están</w:t>
+        <w:t xml:space="preserve">Cómo sale cada número</w:t>
       </w:r>
     </w:p>
     <w:tbl>
@@ -8824,7 +9571,7 @@
         <w:keepNext/>
       </w:pPr>
       <w:r>
-        <w:t xml:space="preserve">Lo que falta</w:t>
+        <w:t xml:space="preserve">Cuánto creerle</w:t>
       </w:r>
     </w:p>
     <w:p>
@@ -8841,10 +9588,10 @@
           <w:b/>
           <w:bCs/>
         </w:rPr>
-        <w:t xml:space="preserve">Un detector.</w:t>
-      </w:r>
-      <w:r>
-        <w:t xml:space="preserve"> Las redes de hoy dicen qué hay en el recuadro del centro; no dicen cuántos píxeles ocupa el vehículo ni dónde está. Sin ese dato las cuentas no tienen de dónde salir. Hace falta sumar una red que marque el recuadro de cada objeto.</w:t>
+        <w:t xml:space="preserve">No se probó con vehículos reales.</w:t>
+      </w:r>
+      <w:r>
+        <w:t xml:space="preserve"> Las cuentas están probadas con un auto simulado que viene a 36 km/h, y el camino completo con fotos fijas. Falta salir a la calle con una cinta métrica.</w:t>
       </w:r>
     </w:p>
     <w:p>
@@ -8861,10 +9608,10 @@
           <w:b/>
           <w:bCs/>
         </w:rPr>
-        <w:t xml:space="preserve">Precisión.</w:t>
-      </w:r>
-      <w:r>
-        <w:t xml:space="preserve"> Aun con detector, la distancia tiene un error de al menos 15 %, porque los vehículos no miden todos lo mismo. La velocidad, que sale de restar dos distancias, es peor: sirve para «viene rápido», no para un radar de tránsito.</w:t>
+        <w:t xml:space="preserve">La distancia tiene un error de al menos 15 %,</w:t>
+      </w:r>
+      <w:r>
+        <w:t xml:space="preserve"> porque los vehículos no miden todos lo mismo, y depende de cargar bien el campo de visión de la cámara.</w:t>
       </w:r>
     </w:p>
     <w:p>
@@ -8881,27 +9628,10 @@
           <w:b/>
           <w:bCs/>
         </w:rPr>
-        <w:t xml:space="preserve">Para velocidad de verdad</w:t>
-      </w:r>
-      <w:r>
-        <w:t xml:space="preserve"> lo que corresponde es un radar Doppler de 24 GHz, que la mide directamente. Está en la lista de materiales y hay pines libres para conectarlo.</w:t>
-      </w:r>
-    </w:p>
-    <w:p>
-      <w:pPr>
-        <w:pStyle w:val="Heading1"/>
-        <w:keepNext/>
-      </w:pPr>
-      <w:r>
-        <w:t xml:space="preserve">12. Privacidad</w:t>
-      </w:r>
-    </w:p>
-    <w:p>
-      <w:pPr>
-        <w:spacing w:after="140"/>
-      </w:pPr>
-      <w:r>
-        <w:t xml:space="preserve">Las gafas llevan una cámara en la cara de alguien. Hay cosas que se decidió que no hagan.</w:t>
+        <w:t xml:space="preserve">La velocidad es peor:</w:t>
+      </w:r>
+      <w:r>
+        <w:t xml:space="preserve"> sale de cómo cambia la distancia en tres segundos, a dos cuadros por segundo. Sirve para «viene rápido», no para un radar de tránsito. Sólo cuenta lo que viene de frente.</w:t>
       </w:r>
     </w:p>
     <w:p>
@@ -8918,10 +9648,7 @@
           <w:b/>
           <w:bCs/>
         </w:rPr>
-        <w:t xml:space="preserve">No identifican personas.</w:t>
-      </w:r>
-      <w:r>
-        <w:t xml:space="preserve"> Reconocen que hay una persona, como categoría. No dicen quién es, ni buscan su nombre o sus redes por la cara. Reconocer a un desconocido y juntarle los datos es el daño a la privacidad en sí, aunque cada dato suelto sea público.</w:t>
+        <w:t xml:space="preserve">Si el vehículo está cortado por el borde de la imagen, no se mide.</w:t>
       </w:r>
     </w:p>
     <w:p>
@@ -8938,10 +9665,27 @@
           <w:b/>
           <w:bCs/>
         </w:rPr>
-        <w:t xml:space="preserve">La consulta de marca y modelo es sólo para aparatos.</w:t>
-      </w:r>
-      <w:r>
-        <w:t xml:space="preserve"> Se niega si hay una persona en el recuadro, manda únicamente el recorte, y la respuesta no tiene dónde poner un nombre.</w:t>
+        <w:t xml:space="preserve">Para velocidad de verdad</w:t>
+      </w:r>
+      <w:r>
+        <w:t xml:space="preserve"> lo que corresponde es un radar Doppler de 24 GHz, que la mide directamente. Está en la lista de materiales y hay pines libres para conectarlo.</w:t>
+      </w:r>
+    </w:p>
+    <w:p>
+      <w:pPr>
+        <w:pStyle w:val="Heading1"/>
+        <w:keepNext/>
+      </w:pPr>
+      <w:r>
+        <w:t xml:space="preserve">12. Privacidad</w:t>
+      </w:r>
+    </w:p>
+    <w:p>
+      <w:pPr>
+        <w:spacing w:after="140"/>
+      </w:pPr>
+      <w:r>
+        <w:t xml:space="preserve">Las gafas llevan una cámara en la cara de alguien. Hay cosas que se decidió que no hagan.</w:t>
       </w:r>
     </w:p>
     <w:p>
@@ -8958,10 +9702,10 @@
           <w:b/>
           <w:bCs/>
         </w:rPr>
-        <w:t xml:space="preserve">No se guardan imágenes</w:t>
-      </w:r>
-      <w:r>
-        <w:t xml:space="preserve">, ni en disco ni en la base.</w:t>
+        <w:t xml:space="preserve">No identifican personas.</w:t>
+      </w:r>
+      <w:r>
+        <w:t xml:space="preserve"> Reconocen que hay una persona, como categoría. No dicen quién es, ni buscan su nombre o sus redes por la cara. Reconocer a un desconocido y juntarle los datos es el daño a la privacidad en sí, aunque cada dato suelto sea público.</w:t>
       </w:r>
     </w:p>
     <w:p>
@@ -8978,7 +9722,47 @@
           <w:b/>
           <w:bCs/>
         </w:rPr>
-        <w:t xml:space="preserve">Sin la clave de Gemini, nada sale de la computadora.</w:t>
+        <w:t xml:space="preserve">La consulta de marca y modelo es sólo para aparatos.</w:t>
+      </w:r>
+      <w:r>
+        <w:t xml:space="preserve"> Se niega si hay una persona en el recuadro, manda únicamente el recorte, y la respuesta no tiene dónde poner un nombre.</w:t>
+      </w:r>
+    </w:p>
+    <w:p>
+      <w:pPr>
+        <w:pStyle w:val="ListParagraph"/>
+        <w:numPr>
+          <w:ilvl w:val="0"/>
+          <w:numId w:val="2"/>
+        </w:numPr>
+        <w:spacing w:after="80"/>
+      </w:pPr>
+      <w:r>
+        <w:rPr>
+          <w:b/>
+          <w:bCs/>
+        </w:rPr>
+        <w:t xml:space="preserve">No se guardan imágenes</w:t>
+      </w:r>
+      <w:r>
+        <w:t xml:space="preserve">, ni en disco ni en la base.</w:t>
+      </w:r>
+    </w:p>
+    <w:p>
+      <w:pPr>
+        <w:pStyle w:val="ListParagraph"/>
+        <w:numPr>
+          <w:ilvl w:val="0"/>
+          <w:numId w:val="2"/>
+        </w:numPr>
+        <w:spacing w:after="80"/>
+      </w:pPr>
+      <w:r>
+        <w:rPr>
+          <w:b/>
+          <w:bCs/>
+        </w:rPr>
+        <w:t xml:space="preserve">Sin una clave de LLM (DeepSeek o Gemini), nada sale de la computadora.</w:t>
       </w:r>
     </w:p>
     <w:p>
@@ -9514,7 +10298,7 @@
         <w:spacing w:after="140"/>
       </w:pPr>
       <w:r>
-        <w:t xml:space="preserve">Para la voz y para marca y modelo hay que poner una clave de Gemini en el archivo </w:t>
+        <w:t xml:space="preserve">Para conversar y para marca y modelo hay que poner una clave en el archivo </w:t>
       </w:r>
       <w:r>
         <w:rPr>
@@ -9525,7 +10309,44 @@
         <w:t xml:space="preserve">.env</w:t>
       </w:r>
       <w:r>
-        <w:t xml:space="preserve">. Tiene que ser una clave nueva, no la de MIIA, porque comparten cuota.</w:t>
+        <w:t xml:space="preserve">: </w:t>
+      </w:r>
+      <w:r>
+        <w:rPr>
+          <w:rFonts w:ascii="Consolas" w:cs="Consolas" w:eastAsia="Consolas" w:hAnsi="Consolas"/>
+          <w:sz w:val="20"/>
+          <w:szCs w:val="20"/>
+        </w:rPr>
+        <w:t xml:space="preserve">DEEPSEEK_API_KEY</w:t>
+      </w:r>
+      <w:r>
+        <w:t xml:space="preserve"> o </w:t>
+      </w:r>
+      <w:r>
+        <w:rPr>
+          <w:rFonts w:ascii="Consolas" w:cs="Consolas" w:eastAsia="Consolas" w:hAnsi="Consolas"/>
+          <w:sz w:val="20"/>
+          <w:szCs w:val="20"/>
+        </w:rPr>
+        <w:t xml:space="preserve">GEMINI_API_KEY</w:t>
+      </w:r>
+      <w:r>
+        <w:t xml:space="preserve">. La de Gemini tiene que ser una clave nueva, no la de MIIA, porque comparten cuota.</w:t>
+      </w:r>
+    </w:p>
+    <w:p>
+      <w:pPr>
+        <w:spacing w:after="140"/>
+      </w:pPr>
+      <w:r>
+        <w:rPr>
+          <w:b/>
+          <w:bCs/>
+        </w:rPr>
+        <w:t xml:space="preserve">DeepSeek conversa por escrito: no tiene audio.</w:t>
+      </w:r>
+      <w:r>
+        <w:t xml:space="preserve"> En el emulador escucha y habla el navegador (Edge o Chrome). Unas gafas de verdad, con DeepSeek, todavía no pueden conversar por voz: falta un transcriptor y un sintetizador en el cerebro. Con Gemini Live la voz va y viene como audio.</w:t>
       </w:r>
     </w:p>
     <w:p>
@@ -9668,7 +10489,7 @@
                 <w:sz w:val="20"/>
                 <w:szCs w:val="20"/>
               </w:rPr>
-              <w:t xml:space="preserve">La voz y la consulta de marca y modelo contra Gemini</w:t>
+              <w:t xml:space="preserve">La conversación y la consulta de marca y modelo contra DeepSeek o Gemini</w:t>
             </w:r>
           </w:p>
         </w:tc>
@@ -9699,7 +10520,7 @@
                 <w:sz w:val="20"/>
                 <w:szCs w:val="20"/>
               </w:rPr>
-              <w:t xml:space="preserve">El cerebro de punta a punta, con fotos de prueba mandadas como cuadros de cámara</w:t>
+              <w:t xml:space="preserve">El cerebro de punta a punta, con fotos de prueba y escenas reales mandadas como cuadros de cámara</w:t>
             </w:r>
           </w:p>
         </w:tc>
@@ -9726,6 +10547,63 @@
                 <w:szCs w:val="20"/>
               </w:rPr>
               <w:t xml:space="preserve">El micrófono del navegador</w:t>
+            </w:r>
+          </w:p>
+        </w:tc>
+      </w:tr>
+      <w:tr>
+        <w:trPr>
+          <w:tblHeader w:val="off"/>
+        </w:trPr>
+        <w:tc>
+          <w:tcPr>
+            <w:tcW w:type="dxa" w:w="4513"/>
+            <w:tcBorders>
+              <w:top w:val="single" w:color="B8C2CC" w:sz="4"/>
+              <w:left w:val="single" w:color="B8C2CC" w:sz="4"/>
+              <w:bottom w:val="single" w:color="B8C2CC" w:sz="4"/>
+              <w:right w:val="single" w:color="B8C2CC" w:sz="4"/>
+            </w:tcBorders>
+            <w:tcMar>
+              <w:top w:type="dxa" w:w="70"/>
+              <w:left w:type="dxa" w:w="110"/>
+              <w:bottom w:type="dxa" w:w="70"/>
+              <w:right w:type="dxa" w:w="110"/>
+            </w:tcMar>
+          </w:tcPr>
+          <w:p>
+            <w:r>
+              <w:rPr>
+                <w:sz w:val="20"/>
+                <w:szCs w:val="20"/>
+              </w:rPr>
+              <w:t xml:space="preserve">El detector contra las anotaciones de COCO</w:t>
+            </w:r>
+          </w:p>
+        </w:tc>
+        <w:tc>
+          <w:tcPr>
+            <w:tcW w:type="dxa" w:w="4513"/>
+            <w:tcBorders>
+              <w:top w:val="single" w:color="B8C2CC" w:sz="4"/>
+              <w:left w:val="single" w:color="B8C2CC" w:sz="4"/>
+              <w:bottom w:val="single" w:color="B8C2CC" w:sz="4"/>
+              <w:right w:val="single" w:color="B8C2CC" w:sz="4"/>
+            </w:tcBorders>
+            <w:tcMar>
+              <w:top w:type="dxa" w:w="70"/>
+              <w:left w:type="dxa" w:w="110"/>
+              <w:bottom w:type="dxa" w:w="70"/>
+              <w:right w:type="dxa" w:w="110"/>
+            </w:tcMar>
+          </w:tcPr>
+          <w:p>
+            <w:r>
+              <w:rPr>
+                <w:sz w:val="20"/>
+                <w:szCs w:val="20"/>
+              </w:rPr>
+              <w:t xml:space="preserve">La distancia y la velocidad con vehículos reales</w:t>
             </w:r>
           </w:p>
         </w:tc>
@@ -9946,7 +10824,7 @@
         <w:spacing w:after="80"/>
       </w:pPr>
       <w:r>
-        <w:t xml:space="preserve">Cargar una clave de Gemini y probar la voz y la consulta de marca y modelo.</w:t>
+        <w:t xml:space="preserve">Cargar una clave de DeepSeek o de Gemini y probar la conversación y la consulta de marca y modelo.</w:t>
       </w:r>
     </w:p>
     <w:p>
@@ -9959,7 +10837,7 @@
         <w:spacing w:after="80"/>
       </w:pPr>
       <w:r>
-        <w:t xml:space="preserve">Sumar un detector para saber dónde está cada objeto: habilita reconocer a distancia y medir vehículos.</w:t>
+        <w:t xml:space="preserve">Probar la distancia y la velocidad en la calle, y calibrar el campo de visión de la cámara.</w:t>
       </w:r>
     </w:p>
     <w:p>

</xml_diff>

<commit_message>
Sumar memoria de objetos, aviso de vehículos, leer texto, guías, medir y firmware
- «¿Dónde dejé…?»: recuerda cuándo y dónde vio cada objeto, nunca personas.
- Aviso de vehículo que está por llegar, mirando el cuadro entero.
- Leer texto con el LLM, con foto grande a pedido; no lee documentos personales.
- Guías guardadas sin internet (primeros auxilios y hogar) e importador de MyFixit.
- Medir objetos con el sensor láser y estimar el peso.
- Pruebas reales «acertó / se equivocó» y su resumen con margen.
- Con DINOv2 vota sólo él: los extractores propios no sumaban.
- Firmware del XIAO ESP32-S3 (compila, sin probar en placa) y guía para Raspberry Pi.
- npm test corre en Linux, pruebas automáticas en GitHub y README en inglés.

Co-Authored-By: Claude Opus 5.5 <noreply@anthropic.com>
Claude-Session: https://claude.ai/code/session_01HaecXdpyG3hryXXGs3Nimf
</commit_message>
<xml_diff>
--- a/docs/Gafas MIIA - Documentación y planos.docx
+++ b/docs/Gafas MIIA - Documentación y planos.docx
@@ -5025,7 +5025,7 @@
                 <w:sz w:val="20"/>
                 <w:szCs w:val="20"/>
               </w:rPr>
-              <w:t xml:space="preserve">Hace votar a las redes de los tres extractores</w:t>
+              <w:t xml:space="preserve">Hace votar a las redes de los extractores que votan</w:t>
             </w:r>
           </w:p>
         </w:tc>
@@ -6281,7 +6281,7 @@
         <w:t xml:space="preserve">class24</w:t>
       </w:r>
       <w:r>
-        <w:t xml:space="preserve">). Las seis redes votan.</w:t>
+        <w:t xml:space="preserve">). Desde el 3 de octubre, con DINOv2 bajado votan sólo sus dos redes; sin él, las de los dos extractores propios.</w:t>
       </w:r>
     </w:p>
     <w:tbl>
@@ -9767,6 +9767,46 @@
     </w:p>
     <w:p>
       <w:pPr>
+        <w:pStyle w:val="ListParagraph"/>
+        <w:numPr>
+          <w:ilvl w:val="0"/>
+          <w:numId w:val="2"/>
+        </w:numPr>
+        <w:spacing w:after="80"/>
+      </w:pPr>
+      <w:r>
+        <w:rPr>
+          <w:b/>
+          <w:bCs/>
+        </w:rPr>
+        <w:t xml:space="preserve">La memoria de objetos («¿dónde dejé…?») nunca guarda personas</w:t>
+      </w:r>
+      <w:r>
+        <w:t xml:space="preserve">: sólo el nombre del objeto, la hora y el lugar que puso el usuario.</w:t>
+      </w:r>
+    </w:p>
+    <w:p>
+      <w:pPr>
+        <w:pStyle w:val="ListParagraph"/>
+        <w:numPr>
+          <w:ilvl w:val="0"/>
+          <w:numId w:val="2"/>
+        </w:numPr>
+        <w:spacing w:after="80"/>
+      </w:pPr>
+      <w:r>
+        <w:rPr>
+          <w:b/>
+          <w:bCs/>
+        </w:rPr>
+        <w:t xml:space="preserve">Leer texto no lee documentos personales</w:t>
+      </w:r>
+      <w:r>
+        <w:t xml:space="preserve">: ni documentos de identidad, ni tarjetas, ni datos de otros. Y no se manda nada si hay una persona en el centro de la mirada.</w:t>
+      </w:r>
+    </w:p>
+    <w:p>
+      <w:pPr>
         <w:pStyle w:val="Heading1"/>
         <w:keepNext/>
       </w:pPr>
@@ -10249,6 +10289,180 @@
                 <w:sz w:val="18"/>
                 <w:szCs w:val="18"/>
               </w:rPr>
+              <w:t xml:space="preserve">npm run tarjeta -- --lugar cocina</w:t>
+            </w:r>
+          </w:p>
+        </w:tc>
+        <w:tc>
+          <w:tcPr>
+            <w:tcW w:type="dxa" w:w="5641"/>
+            <w:tcBorders>
+              <w:top w:val="single" w:color="B8C2CC" w:sz="4"/>
+              <w:left w:val="single" w:color="B8C2CC" w:sz="4"/>
+              <w:bottom w:val="single" w:color="B8C2CC" w:sz="4"/>
+              <w:right w:val="single" w:color="B8C2CC" w:sz="4"/>
+            </w:tcBorders>
+            <w:tcMar>
+              <w:top w:type="dxa" w:w="70"/>
+              <w:left w:type="dxa" w:w="110"/>
+              <w:bottom w:type="dxa" w:w="70"/>
+              <w:right w:type="dxa" w:w="110"/>
+            </w:tcMar>
+          </w:tcPr>
+          <w:p>
+            <w:r>
+              <w:rPr>
+                <w:sz w:val="20"/>
+                <w:szCs w:val="20"/>
+              </w:rPr>
+              <w:t xml:space="preserve">Armar el cartel QR de un lugar, para «¿dónde dejé…?»</w:t>
+            </w:r>
+          </w:p>
+        </w:tc>
+      </w:tr>
+      <w:tr>
+        <w:trPr>
+          <w:tblHeader w:val="off"/>
+        </w:trPr>
+        <w:tc>
+          <w:tcPr>
+            <w:tcW w:type="dxa" w:w="3385"/>
+            <w:tcBorders>
+              <w:top w:val="single" w:color="B8C2CC" w:sz="4"/>
+              <w:left w:val="single" w:color="B8C2CC" w:sz="4"/>
+              <w:bottom w:val="single" w:color="B8C2CC" w:sz="4"/>
+              <w:right w:val="single" w:color="B8C2CC" w:sz="4"/>
+            </w:tcBorders>
+            <w:tcMar>
+              <w:top w:type="dxa" w:w="70"/>
+              <w:left w:type="dxa" w:w="110"/>
+              <w:bottom w:type="dxa" w:w="70"/>
+              <w:right w:type="dxa" w:w="110"/>
+            </w:tcMar>
+          </w:tcPr>
+          <w:p>
+            <w:r>
+              <w:rPr>
+                <w:rFonts w:ascii="Consolas" w:cs="Consolas" w:eastAsia="Consolas" w:hAnsi="Consolas"/>
+                <w:sz w:val="18"/>
+                <w:szCs w:val="18"/>
+              </w:rPr>
+              <w:t xml:space="preserve">npm run pruebas-reales</w:t>
+            </w:r>
+          </w:p>
+        </w:tc>
+        <w:tc>
+          <w:tcPr>
+            <w:tcW w:type="dxa" w:w="5641"/>
+            <w:tcBorders>
+              <w:top w:val="single" w:color="B8C2CC" w:sz="4"/>
+              <w:left w:val="single" w:color="B8C2CC" w:sz="4"/>
+              <w:bottom w:val="single" w:color="B8C2CC" w:sz="4"/>
+              <w:right w:val="single" w:color="B8C2CC" w:sz="4"/>
+            </w:tcBorders>
+            <w:tcMar>
+              <w:top w:type="dxa" w:w="70"/>
+              <w:left w:type="dxa" w:w="110"/>
+              <w:bottom w:type="dxa" w:w="70"/>
+              <w:right w:type="dxa" w:w="110"/>
+            </w:tcMar>
+          </w:tcPr>
+          <w:p>
+            <w:r>
+              <w:rPr>
+                <w:sz w:val="20"/>
+                <w:szCs w:val="20"/>
+              </w:rPr>
+              <w:t xml:space="preserve">Cuánto acierta con la webcam, según lo anotado en el emulador</w:t>
+            </w:r>
+          </w:p>
+        </w:tc>
+      </w:tr>
+      <w:tr>
+        <w:trPr>
+          <w:tblHeader w:val="off"/>
+        </w:trPr>
+        <w:tc>
+          <w:tcPr>
+            <w:tcW w:type="dxa" w:w="3385"/>
+            <w:tcBorders>
+              <w:top w:val="single" w:color="B8C2CC" w:sz="4"/>
+              <w:left w:val="single" w:color="B8C2CC" w:sz="4"/>
+              <w:bottom w:val="single" w:color="B8C2CC" w:sz="4"/>
+              <w:right w:val="single" w:color="B8C2CC" w:sz="4"/>
+            </w:tcBorders>
+            <w:tcMar>
+              <w:top w:type="dxa" w:w="70"/>
+              <w:left w:type="dxa" w:w="110"/>
+              <w:bottom w:type="dxa" w:w="70"/>
+              <w:right w:type="dxa" w:w="110"/>
+            </w:tcMar>
+          </w:tcPr>
+          <w:p>
+            <w:r>
+              <w:rPr>
+                <w:rFonts w:ascii="Consolas" w:cs="Consolas" w:eastAsia="Consolas" w:hAnsi="Consolas"/>
+                <w:sz w:val="18"/>
+                <w:szCs w:val="18"/>
+              </w:rPr>
+              <w:t xml:space="preserve">npm run importar-myfixit -- &lt;archivo&gt;</w:t>
+            </w:r>
+          </w:p>
+        </w:tc>
+        <w:tc>
+          <w:tcPr>
+            <w:tcW w:type="dxa" w:w="5641"/>
+            <w:tcBorders>
+              <w:top w:val="single" w:color="B8C2CC" w:sz="4"/>
+              <w:left w:val="single" w:color="B8C2CC" w:sz="4"/>
+              <w:bottom w:val="single" w:color="B8C2CC" w:sz="4"/>
+              <w:right w:val="single" w:color="B8C2CC" w:sz="4"/>
+            </w:tcBorders>
+            <w:tcMar>
+              <w:top w:type="dxa" w:w="70"/>
+              <w:left w:type="dxa" w:w="110"/>
+              <w:bottom w:type="dxa" w:w="70"/>
+              <w:right w:type="dxa" w:w="110"/>
+            </w:tcMar>
+          </w:tcPr>
+          <w:p>
+            <w:r>
+              <w:rPr>
+                <w:sz w:val="20"/>
+                <w:szCs w:val="20"/>
+              </w:rPr>
+              <w:t xml:space="preserve">Convertir manuales de iFixit en guías</w:t>
+            </w:r>
+          </w:p>
+        </w:tc>
+      </w:tr>
+      <w:tr>
+        <w:trPr>
+          <w:tblHeader w:val="off"/>
+        </w:trPr>
+        <w:tc>
+          <w:tcPr>
+            <w:tcW w:type="dxa" w:w="3385"/>
+            <w:tcBorders>
+              <w:top w:val="single" w:color="B8C2CC" w:sz="4"/>
+              <w:left w:val="single" w:color="B8C2CC" w:sz="4"/>
+              <w:bottom w:val="single" w:color="B8C2CC" w:sz="4"/>
+              <w:right w:val="single" w:color="B8C2CC" w:sz="4"/>
+            </w:tcBorders>
+            <w:tcMar>
+              <w:top w:type="dxa" w:w="70"/>
+              <w:left w:type="dxa" w:w="110"/>
+              <w:bottom w:type="dxa" w:w="70"/>
+              <w:right w:type="dxa" w:w="110"/>
+            </w:tcMar>
+          </w:tcPr>
+          <w:p>
+            <w:r>
+              <w:rPr>
+                <w:rFonts w:ascii="Consolas" w:cs="Consolas" w:eastAsia="Consolas" w:hAnsi="Consolas"/>
+                <w:sz w:val="18"/>
+                <w:szCs w:val="18"/>
+              </w:rPr>
               <w:t xml:space="preserve">npm run documento</w:t>
             </w:r>
           </w:p>
@@ -10355,7 +10569,844 @@
         <w:keepNext/>
       </w:pPr>
       <w:r>
-        <w:t xml:space="preserve">14. Qué está probado y qué no</w:t>
+        <w:t xml:space="preserve">14. Lo que se sumó el 3 de octubre</w:t>
+      </w:r>
+    </w:p>
+    <w:p>
+      <w:pPr>
+        <w:spacing w:after="140"/>
+      </w:pPr>
+      <w:r>
+        <w:t xml:space="preserve">Todo es opcional: sin clave, sin detector o sin sensor, el cerebro arranca igual y cada cosa avisa qué le falta. El detalle está en la décima pasada de </w:t>
+      </w:r>
+      <w:r>
+        <w:rPr>
+          <w:rFonts w:ascii="Consolas" w:cs="Consolas" w:eastAsia="Consolas" w:hAnsi="Consolas"/>
+          <w:sz w:val="20"/>
+          <w:szCs w:val="20"/>
+        </w:rPr>
+        <w:t xml:space="preserve">PLAN.md</w:t>
+      </w:r>
+      <w:r>
+        <w:t xml:space="preserve">.</w:t>
+      </w:r>
+    </w:p>
+    <w:tbl>
+      <w:tblPr>
+        <w:tblW w:type="dxa" w:w="9026"/>
+        <w:tblBorders>
+          <w:top w:val="single" w:color="auto" w:sz="4"/>
+          <w:left w:val="single" w:color="auto" w:sz="4"/>
+          <w:bottom w:val="single" w:color="auto" w:sz="4"/>
+          <w:right w:val="single" w:color="auto" w:sz="4"/>
+          <w:insideH w:val="single" w:color="auto" w:sz="4"/>
+          <w:insideV w:val="single" w:color="auto" w:sz="4"/>
+        </w:tblBorders>
+      </w:tblPr>
+      <w:tblGrid>
+        <w:gridCol w:w="2257"/>
+        <w:gridCol w:w="4513"/>
+        <w:gridCol w:w="2256"/>
+      </w:tblGrid>
+      <w:tr>
+        <w:trPr>
+          <w:tblHeader/>
+        </w:trPr>
+        <w:tc>
+          <w:tcPr>
+            <w:tcW w:type="dxa" w:w="2257"/>
+            <w:tcBorders>
+              <w:top w:val="single" w:color="B8C2CC" w:sz="4"/>
+              <w:left w:val="single" w:color="B8C2CC" w:sz="4"/>
+              <w:bottom w:val="single" w:color="B8C2CC" w:sz="4"/>
+              <w:right w:val="single" w:color="B8C2CC" w:sz="4"/>
+            </w:tcBorders>
+            <w:shd w:fill="DCE6F1" w:val="clear"/>
+            <w:tcMar>
+              <w:top w:type="dxa" w:w="70"/>
+              <w:left w:type="dxa" w:w="110"/>
+              <w:bottom w:type="dxa" w:w="70"/>
+              <w:right w:type="dxa" w:w="110"/>
+            </w:tcMar>
+          </w:tcPr>
+          <w:p>
+            <w:r>
+              <w:rPr>
+                <w:b/>
+                <w:bCs/>
+                <w:sz w:val="20"/>
+                <w:szCs w:val="20"/>
+              </w:rPr>
+              <w:t xml:space="preserve">Qué</w:t>
+            </w:r>
+          </w:p>
+        </w:tc>
+        <w:tc>
+          <w:tcPr>
+            <w:tcW w:type="dxa" w:w="4513"/>
+            <w:tcBorders>
+              <w:top w:val="single" w:color="B8C2CC" w:sz="4"/>
+              <w:left w:val="single" w:color="B8C2CC" w:sz="4"/>
+              <w:bottom w:val="single" w:color="B8C2CC" w:sz="4"/>
+              <w:right w:val="single" w:color="B8C2CC" w:sz="4"/>
+            </w:tcBorders>
+            <w:shd w:fill="DCE6F1" w:val="clear"/>
+            <w:tcMar>
+              <w:top w:type="dxa" w:w="70"/>
+              <w:left w:type="dxa" w:w="110"/>
+              <w:bottom w:type="dxa" w:w="70"/>
+              <w:right w:type="dxa" w:w="110"/>
+            </w:tcMar>
+          </w:tcPr>
+          <w:p>
+            <w:r>
+              <w:rPr>
+                <w:b/>
+                <w:bCs/>
+                <w:sz w:val="20"/>
+                <w:szCs w:val="20"/>
+              </w:rPr>
+              <w:t xml:space="preserve">Cómo anda</w:t>
+            </w:r>
+          </w:p>
+        </w:tc>
+        <w:tc>
+          <w:tcPr>
+            <w:tcW w:type="dxa" w:w="2256"/>
+            <w:tcBorders>
+              <w:top w:val="single" w:color="B8C2CC" w:sz="4"/>
+              <w:left w:val="single" w:color="B8C2CC" w:sz="4"/>
+              <w:bottom w:val="single" w:color="B8C2CC" w:sz="4"/>
+              <w:right w:val="single" w:color="B8C2CC" w:sz="4"/>
+            </w:tcBorders>
+            <w:shd w:fill="DCE6F1" w:val="clear"/>
+            <w:tcMar>
+              <w:top w:type="dxa" w:w="70"/>
+              <w:left w:type="dxa" w:w="110"/>
+              <w:bottom w:type="dxa" w:w="70"/>
+              <w:right w:type="dxa" w:w="110"/>
+            </w:tcMar>
+          </w:tcPr>
+          <w:p>
+            <w:r>
+              <w:rPr>
+                <w:b/>
+                <w:bCs/>
+                <w:sz w:val="20"/>
+                <w:szCs w:val="20"/>
+              </w:rPr>
+              <w:t xml:space="preserve">Necesita</w:t>
+            </w:r>
+          </w:p>
+        </w:tc>
+      </w:tr>
+      <w:tr>
+        <w:trPr>
+          <w:tblHeader w:val="off"/>
+        </w:trPr>
+        <w:tc>
+          <w:tcPr>
+            <w:tcW w:type="dxa" w:w="2257"/>
+            <w:tcBorders>
+              <w:top w:val="single" w:color="B8C2CC" w:sz="4"/>
+              <w:left w:val="single" w:color="B8C2CC" w:sz="4"/>
+              <w:bottom w:val="single" w:color="B8C2CC" w:sz="4"/>
+              <w:right w:val="single" w:color="B8C2CC" w:sz="4"/>
+            </w:tcBorders>
+            <w:tcMar>
+              <w:top w:type="dxa" w:w="70"/>
+              <w:left w:type="dxa" w:w="110"/>
+              <w:bottom w:type="dxa" w:w="70"/>
+              <w:right w:type="dxa" w:w="110"/>
+            </w:tcMar>
+          </w:tcPr>
+          <w:p>
+            <w:r>
+              <w:rPr>
+                <w:sz w:val="20"/>
+                <w:szCs w:val="20"/>
+              </w:rPr>
+              <w:t xml:space="preserve">«¿Dónde dejé…?»</w:t>
+            </w:r>
+          </w:p>
+        </w:tc>
+        <w:tc>
+          <w:tcPr>
+            <w:tcW w:type="dxa" w:w="4513"/>
+            <w:tcBorders>
+              <w:top w:val="single" w:color="B8C2CC" w:sz="4"/>
+              <w:left w:val="single" w:color="B8C2CC" w:sz="4"/>
+              <w:bottom w:val="single" w:color="B8C2CC" w:sz="4"/>
+              <w:right w:val="single" w:color="B8C2CC" w:sz="4"/>
+            </w:tcBorders>
+            <w:tcMar>
+              <w:top w:type="dxa" w:w="70"/>
+              <w:left w:type="dxa" w:w="110"/>
+              <w:bottom w:type="dxa" w:w="70"/>
+              <w:right w:type="dxa" w:w="110"/>
+            </w:tcMar>
+          </w:tcPr>
+          <w:p>
+            <w:r>
+              <w:rPr>
+                <w:sz w:val="20"/>
+                <w:szCs w:val="20"/>
+              </w:rPr>
+              <w:t xml:space="preserve">Recuerda cuándo y dónde vio cada objeto por última vez. El lugar lo marca el usuario, o un cartel QR que diga LUGAR:cocina.</w:t>
+            </w:r>
+          </w:p>
+        </w:tc>
+        <w:tc>
+          <w:tcPr>
+            <w:tcW w:type="dxa" w:w="2256"/>
+            <w:tcBorders>
+              <w:top w:val="single" w:color="B8C2CC" w:sz="4"/>
+              <w:left w:val="single" w:color="B8C2CC" w:sz="4"/>
+              <w:bottom w:val="single" w:color="B8C2CC" w:sz="4"/>
+              <w:right w:val="single" w:color="B8C2CC" w:sz="4"/>
+            </w:tcBorders>
+            <w:tcMar>
+              <w:top w:type="dxa" w:w="70"/>
+              <w:left w:type="dxa" w:w="110"/>
+              <w:bottom w:type="dxa" w:w="70"/>
+              <w:right w:type="dxa" w:w="110"/>
+            </w:tcMar>
+          </w:tcPr>
+          <w:p>
+            <w:r>
+              <w:rPr>
+                <w:sz w:val="20"/>
+                <w:szCs w:val="20"/>
+              </w:rPr>
+              <w:t xml:space="preserve">Nada</w:t>
+            </w:r>
+          </w:p>
+        </w:tc>
+      </w:tr>
+      <w:tr>
+        <w:trPr>
+          <w:tblHeader w:val="off"/>
+        </w:trPr>
+        <w:tc>
+          <w:tcPr>
+            <w:tcW w:type="dxa" w:w="2257"/>
+            <w:tcBorders>
+              <w:top w:val="single" w:color="B8C2CC" w:sz="4"/>
+              <w:left w:val="single" w:color="B8C2CC" w:sz="4"/>
+              <w:bottom w:val="single" w:color="B8C2CC" w:sz="4"/>
+              <w:right w:val="single" w:color="B8C2CC" w:sz="4"/>
+            </w:tcBorders>
+            <w:tcMar>
+              <w:top w:type="dxa" w:w="70"/>
+              <w:left w:type="dxa" w:w="110"/>
+              <w:bottom w:type="dxa" w:w="70"/>
+              <w:right w:type="dxa" w:w="110"/>
+            </w:tcMar>
+          </w:tcPr>
+          <w:p>
+            <w:r>
+              <w:rPr>
+                <w:sz w:val="20"/>
+                <w:szCs w:val="20"/>
+              </w:rPr>
+              <w:t xml:space="preserve">Aviso de vehículo</w:t>
+            </w:r>
+          </w:p>
+        </w:tc>
+        <w:tc>
+          <w:tcPr>
+            <w:tcW w:type="dxa" w:w="4513"/>
+            <w:tcBorders>
+              <w:top w:val="single" w:color="B8C2CC" w:sz="4"/>
+              <w:left w:val="single" w:color="B8C2CC" w:sz="4"/>
+              <w:bottom w:val="single" w:color="B8C2CC" w:sz="4"/>
+              <w:right w:val="single" w:color="B8C2CC" w:sz="4"/>
+            </w:tcBorders>
+            <w:tcMar>
+              <w:top w:type="dxa" w:w="70"/>
+              <w:left w:type="dxa" w:w="110"/>
+              <w:bottom w:type="dxa" w:w="70"/>
+              <w:right w:type="dxa" w:w="110"/>
+            </w:tcMar>
+          </w:tcPr>
+          <w:p>
+            <w:r>
+              <w:rPr>
+                <w:sz w:val="20"/>
+                <w:szCs w:val="20"/>
+              </w:rPr>
+              <w:t xml:space="preserve">Mira el cuadro entero y avisa con pitido y «¡CUIDADO!» si un vehículo llega en menos de 4 segundos. Es una ayuda: no reemplaza mirar.</w:t>
+            </w:r>
+          </w:p>
+        </w:tc>
+        <w:tc>
+          <w:tcPr>
+            <w:tcW w:type="dxa" w:w="2256"/>
+            <w:tcBorders>
+              <w:top w:val="single" w:color="B8C2CC" w:sz="4"/>
+              <w:left w:val="single" w:color="B8C2CC" w:sz="4"/>
+              <w:bottom w:val="single" w:color="B8C2CC" w:sz="4"/>
+              <w:right w:val="single" w:color="B8C2CC" w:sz="4"/>
+            </w:tcBorders>
+            <w:tcMar>
+              <w:top w:type="dxa" w:w="70"/>
+              <w:left w:type="dxa" w:w="110"/>
+              <w:bottom w:type="dxa" w:w="70"/>
+              <w:right w:type="dxa" w:w="110"/>
+            </w:tcMar>
+          </w:tcPr>
+          <w:p>
+            <w:r>
+              <w:rPr>
+                <w:sz w:val="20"/>
+                <w:szCs w:val="20"/>
+              </w:rPr>
+              <w:t xml:space="preserve">El detector</w:t>
+            </w:r>
+          </w:p>
+        </w:tc>
+      </w:tr>
+      <w:tr>
+        <w:trPr>
+          <w:tblHeader w:val="off"/>
+        </w:trPr>
+        <w:tc>
+          <w:tcPr>
+            <w:tcW w:type="dxa" w:w="2257"/>
+            <w:tcBorders>
+              <w:top w:val="single" w:color="B8C2CC" w:sz="4"/>
+              <w:left w:val="single" w:color="B8C2CC" w:sz="4"/>
+              <w:bottom w:val="single" w:color="B8C2CC" w:sz="4"/>
+              <w:right w:val="single" w:color="B8C2CC" w:sz="4"/>
+            </w:tcBorders>
+            <w:tcMar>
+              <w:top w:type="dxa" w:w="70"/>
+              <w:left w:type="dxa" w:w="110"/>
+              <w:bottom w:type="dxa" w:w="70"/>
+              <w:right w:type="dxa" w:w="110"/>
+            </w:tcMar>
+          </w:tcPr>
+          <w:p>
+            <w:r>
+              <w:rPr>
+                <w:sz w:val="20"/>
+                <w:szCs w:val="20"/>
+              </w:rPr>
+              <w:t xml:space="preserve">Leer texto</w:t>
+            </w:r>
+          </w:p>
+        </w:tc>
+        <w:tc>
+          <w:tcPr>
+            <w:tcW w:type="dxa" w:w="4513"/>
+            <w:tcBorders>
+              <w:top w:val="single" w:color="B8C2CC" w:sz="4"/>
+              <w:left w:val="single" w:color="B8C2CC" w:sz="4"/>
+              <w:bottom w:val="single" w:color="B8C2CC" w:sz="4"/>
+              <w:right w:val="single" w:color="B8C2CC" w:sz="4"/>
+            </w:tcBorders>
+            <w:tcMar>
+              <w:top w:type="dxa" w:w="70"/>
+              <w:left w:type="dxa" w:w="110"/>
+              <w:bottom w:type="dxa" w:w="70"/>
+              <w:right w:type="dxa" w:w="110"/>
+            </w:tcMar>
+          </w:tcPr>
+          <w:p>
+            <w:r>
+              <w:rPr>
+                <w:sz w:val="20"/>
+                <w:szCs w:val="20"/>
+              </w:rPr>
+              <w:t xml:space="preserve">Carteles, etiquetas y vencimientos, con traducción. Las gafas mandan una foto más grande a pedido.</w:t>
+            </w:r>
+          </w:p>
+        </w:tc>
+        <w:tc>
+          <w:tcPr>
+            <w:tcW w:type="dxa" w:w="2256"/>
+            <w:tcBorders>
+              <w:top w:val="single" w:color="B8C2CC" w:sz="4"/>
+              <w:left w:val="single" w:color="B8C2CC" w:sz="4"/>
+              <w:bottom w:val="single" w:color="B8C2CC" w:sz="4"/>
+              <w:right w:val="single" w:color="B8C2CC" w:sz="4"/>
+            </w:tcBorders>
+            <w:tcMar>
+              <w:top w:type="dxa" w:w="70"/>
+              <w:left w:type="dxa" w:w="110"/>
+              <w:bottom w:type="dxa" w:w="70"/>
+              <w:right w:type="dxa" w:w="110"/>
+            </w:tcMar>
+          </w:tcPr>
+          <w:p>
+            <w:r>
+              <w:rPr>
+                <w:sz w:val="20"/>
+                <w:szCs w:val="20"/>
+              </w:rPr>
+              <w:t xml:space="preserve">Clave del LLM</w:t>
+            </w:r>
+          </w:p>
+        </w:tc>
+      </w:tr>
+      <w:tr>
+        <w:trPr>
+          <w:tblHeader w:val="off"/>
+        </w:trPr>
+        <w:tc>
+          <w:tcPr>
+            <w:tcW w:type="dxa" w:w="2257"/>
+            <w:tcBorders>
+              <w:top w:val="single" w:color="B8C2CC" w:sz="4"/>
+              <w:left w:val="single" w:color="B8C2CC" w:sz="4"/>
+              <w:bottom w:val="single" w:color="B8C2CC" w:sz="4"/>
+              <w:right w:val="single" w:color="B8C2CC" w:sz="4"/>
+            </w:tcBorders>
+            <w:tcMar>
+              <w:top w:type="dxa" w:w="70"/>
+              <w:left w:type="dxa" w:w="110"/>
+              <w:bottom w:type="dxa" w:w="70"/>
+              <w:right w:type="dxa" w:w="110"/>
+            </w:tcMar>
+          </w:tcPr>
+          <w:p>
+            <w:r>
+              <w:rPr>
+                <w:sz w:val="20"/>
+                <w:szCs w:val="20"/>
+              </w:rPr>
+              <w:t xml:space="preserve">Guías guardadas</w:t>
+            </w:r>
+          </w:p>
+        </w:tc>
+        <w:tc>
+          <w:tcPr>
+            <w:tcW w:type="dxa" w:w="4513"/>
+            <w:tcBorders>
+              <w:top w:val="single" w:color="B8C2CC" w:sz="4"/>
+              <w:left w:val="single" w:color="B8C2CC" w:sz="4"/>
+              <w:bottom w:val="single" w:color="B8C2CC" w:sz="4"/>
+              <w:right w:val="single" w:color="B8C2CC" w:sz="4"/>
+            </w:tcBorders>
+            <w:tcMar>
+              <w:top w:type="dxa" w:w="70"/>
+              <w:left w:type="dxa" w:w="110"/>
+              <w:bottom w:type="dxa" w:w="70"/>
+              <w:right w:type="dxa" w:w="110"/>
+            </w:tcMar>
+          </w:tcPr>
+          <w:p>
+            <w:r>
+              <w:rPr>
+                <w:sz w:val="20"/>
+                <w:szCs w:val="20"/>
+              </w:rPr>
+              <w:t xml:space="preserve">Primeros auxilios y hogar, sin internet. Las de primeros auxilios hay que compararlas con la guía de Cruz Roja Argentina.</w:t>
+            </w:r>
+          </w:p>
+        </w:tc>
+        <w:tc>
+          <w:tcPr>
+            <w:tcW w:type="dxa" w:w="2256"/>
+            <w:tcBorders>
+              <w:top w:val="single" w:color="B8C2CC" w:sz="4"/>
+              <w:left w:val="single" w:color="B8C2CC" w:sz="4"/>
+              <w:bottom w:val="single" w:color="B8C2CC" w:sz="4"/>
+              <w:right w:val="single" w:color="B8C2CC" w:sz="4"/>
+            </w:tcBorders>
+            <w:tcMar>
+              <w:top w:type="dxa" w:w="70"/>
+              <w:left w:type="dxa" w:w="110"/>
+              <w:bottom w:type="dxa" w:w="70"/>
+              <w:right w:type="dxa" w:w="110"/>
+            </w:tcMar>
+          </w:tcPr>
+          <w:p>
+            <w:r>
+              <w:rPr>
+                <w:sz w:val="20"/>
+                <w:szCs w:val="20"/>
+              </w:rPr>
+              <w:t xml:space="preserve">Nada</w:t>
+            </w:r>
+          </w:p>
+        </w:tc>
+      </w:tr>
+      <w:tr>
+        <w:trPr>
+          <w:tblHeader w:val="off"/>
+        </w:trPr>
+        <w:tc>
+          <w:tcPr>
+            <w:tcW w:type="dxa" w:w="2257"/>
+            <w:tcBorders>
+              <w:top w:val="single" w:color="B8C2CC" w:sz="4"/>
+              <w:left w:val="single" w:color="B8C2CC" w:sz="4"/>
+              <w:bottom w:val="single" w:color="B8C2CC" w:sz="4"/>
+              <w:right w:val="single" w:color="B8C2CC" w:sz="4"/>
+            </w:tcBorders>
+            <w:tcMar>
+              <w:top w:type="dxa" w:w="70"/>
+              <w:left w:type="dxa" w:w="110"/>
+              <w:bottom w:type="dxa" w:w="70"/>
+              <w:right w:type="dxa" w:w="110"/>
+            </w:tcMar>
+          </w:tcPr>
+          <w:p>
+            <w:r>
+              <w:rPr>
+                <w:sz w:val="20"/>
+                <w:szCs w:val="20"/>
+              </w:rPr>
+              <w:t xml:space="preserve">Medir objetos</w:t>
+            </w:r>
+          </w:p>
+        </w:tc>
+        <w:tc>
+          <w:tcPr>
+            <w:tcW w:type="dxa" w:w="4513"/>
+            <w:tcBorders>
+              <w:top w:val="single" w:color="B8C2CC" w:sz="4"/>
+              <w:left w:val="single" w:color="B8C2CC" w:sz="4"/>
+              <w:bottom w:val="single" w:color="B8C2CC" w:sz="4"/>
+              <w:right w:val="single" w:color="B8C2CC" w:sz="4"/>
+            </w:tcBorders>
+            <w:tcMar>
+              <w:top w:type="dxa" w:w="70"/>
+              <w:left w:type="dxa" w:w="110"/>
+              <w:bottom w:type="dxa" w:w="70"/>
+              <w:right w:type="dxa" w:w="110"/>
+            </w:tcMar>
+          </w:tcPr>
+          <w:p>
+            <w:r>
+              <w:rPr>
+                <w:sz w:val="20"/>
+                <w:szCs w:val="20"/>
+              </w:rPr>
+              <w:t xml:space="preserve">Ancho y alto del objeto del centro, y peso estimado según el material.</w:t>
+            </w:r>
+          </w:p>
+        </w:tc>
+        <w:tc>
+          <w:tcPr>
+            <w:tcW w:type="dxa" w:w="2256"/>
+            <w:tcBorders>
+              <w:top w:val="single" w:color="B8C2CC" w:sz="4"/>
+              <w:left w:val="single" w:color="B8C2CC" w:sz="4"/>
+              <w:bottom w:val="single" w:color="B8C2CC" w:sz="4"/>
+              <w:right w:val="single" w:color="B8C2CC" w:sz="4"/>
+            </w:tcBorders>
+            <w:tcMar>
+              <w:top w:type="dxa" w:w="70"/>
+              <w:left w:type="dxa" w:w="110"/>
+              <w:bottom w:type="dxa" w:w="70"/>
+              <w:right w:type="dxa" w:w="110"/>
+            </w:tcMar>
+          </w:tcPr>
+          <w:p>
+            <w:r>
+              <w:rPr>
+                <w:sz w:val="20"/>
+                <w:szCs w:val="20"/>
+              </w:rPr>
+              <w:t xml:space="preserve">Detector y VL53L1X</w:t>
+            </w:r>
+          </w:p>
+        </w:tc>
+      </w:tr>
+      <w:tr>
+        <w:trPr>
+          <w:tblHeader w:val="off"/>
+        </w:trPr>
+        <w:tc>
+          <w:tcPr>
+            <w:tcW w:type="dxa" w:w="2257"/>
+            <w:tcBorders>
+              <w:top w:val="single" w:color="B8C2CC" w:sz="4"/>
+              <w:left w:val="single" w:color="B8C2CC" w:sz="4"/>
+              <w:bottom w:val="single" w:color="B8C2CC" w:sz="4"/>
+              <w:right w:val="single" w:color="B8C2CC" w:sz="4"/>
+            </w:tcBorders>
+            <w:tcMar>
+              <w:top w:type="dxa" w:w="70"/>
+              <w:left w:type="dxa" w:w="110"/>
+              <w:bottom w:type="dxa" w:w="70"/>
+              <w:right w:type="dxa" w:w="110"/>
+            </w:tcMar>
+          </w:tcPr>
+          <w:p>
+            <w:r>
+              <w:rPr>
+                <w:sz w:val="20"/>
+                <w:szCs w:val="20"/>
+              </w:rPr>
+              <w:t xml:space="preserve">Pruebas reales</w:t>
+            </w:r>
+          </w:p>
+        </w:tc>
+        <w:tc>
+          <w:tcPr>
+            <w:tcW w:type="dxa" w:w="4513"/>
+            <w:tcBorders>
+              <w:top w:val="single" w:color="B8C2CC" w:sz="4"/>
+              <w:left w:val="single" w:color="B8C2CC" w:sz="4"/>
+              <w:bottom w:val="single" w:color="B8C2CC" w:sz="4"/>
+              <w:right w:val="single" w:color="B8C2CC" w:sz="4"/>
+            </w:tcBorders>
+            <w:tcMar>
+              <w:top w:type="dxa" w:w="70"/>
+              <w:left w:type="dxa" w:w="110"/>
+              <w:bottom w:type="dxa" w:w="70"/>
+              <w:right w:type="dxa" w:w="110"/>
+            </w:tcMar>
+          </w:tcPr>
+          <w:p>
+            <w:r>
+              <w:rPr>
+                <w:sz w:val="20"/>
+                <w:szCs w:val="20"/>
+              </w:rPr>
+              <w:t xml:space="preserve">«Acertó» o «Se equivocó» en el emulador, y un resumen con el margen de error.</w:t>
+            </w:r>
+          </w:p>
+        </w:tc>
+        <w:tc>
+          <w:tcPr>
+            <w:tcW w:type="dxa" w:w="2256"/>
+            <w:tcBorders>
+              <w:top w:val="single" w:color="B8C2CC" w:sz="4"/>
+              <w:left w:val="single" w:color="B8C2CC" w:sz="4"/>
+              <w:bottom w:val="single" w:color="B8C2CC" w:sz="4"/>
+              <w:right w:val="single" w:color="B8C2CC" w:sz="4"/>
+            </w:tcBorders>
+            <w:tcMar>
+              <w:top w:type="dxa" w:w="70"/>
+              <w:left w:type="dxa" w:w="110"/>
+              <w:bottom w:type="dxa" w:w="70"/>
+              <w:right w:type="dxa" w:w="110"/>
+            </w:tcMar>
+          </w:tcPr>
+          <w:p>
+            <w:r>
+              <w:rPr>
+                <w:sz w:val="20"/>
+                <w:szCs w:val="20"/>
+              </w:rPr>
+              <w:t xml:space="preserve">La webcam</w:t>
+            </w:r>
+          </w:p>
+        </w:tc>
+      </w:tr>
+      <w:tr>
+        <w:trPr>
+          <w:tblHeader w:val="off"/>
+        </w:trPr>
+        <w:tc>
+          <w:tcPr>
+            <w:tcW w:type="dxa" w:w="2257"/>
+            <w:tcBorders>
+              <w:top w:val="single" w:color="B8C2CC" w:sz="4"/>
+              <w:left w:val="single" w:color="B8C2CC" w:sz="4"/>
+              <w:bottom w:val="single" w:color="B8C2CC" w:sz="4"/>
+              <w:right w:val="single" w:color="B8C2CC" w:sz="4"/>
+            </w:tcBorders>
+            <w:tcMar>
+              <w:top w:type="dxa" w:w="70"/>
+              <w:left w:type="dxa" w:w="110"/>
+              <w:bottom w:type="dxa" w:w="70"/>
+              <w:right w:type="dxa" w:w="110"/>
+            </w:tcMar>
+          </w:tcPr>
+          <w:p>
+            <w:r>
+              <w:rPr>
+                <w:sz w:val="20"/>
+                <w:szCs w:val="20"/>
+              </w:rPr>
+              <w:t xml:space="preserve">Firmware</w:t>
+            </w:r>
+          </w:p>
+        </w:tc>
+        <w:tc>
+          <w:tcPr>
+            <w:tcW w:type="dxa" w:w="4513"/>
+            <w:tcBorders>
+              <w:top w:val="single" w:color="B8C2CC" w:sz="4"/>
+              <w:left w:val="single" w:color="B8C2CC" w:sz="4"/>
+              <w:bottom w:val="single" w:color="B8C2CC" w:sz="4"/>
+              <w:right w:val="single" w:color="B8C2CC" w:sz="4"/>
+            </w:tcBorders>
+            <w:tcMar>
+              <w:top w:type="dxa" w:w="70"/>
+              <w:left w:type="dxa" w:w="110"/>
+              <w:bottom w:type="dxa" w:w="70"/>
+              <w:right w:type="dxa" w:w="110"/>
+            </w:tcMar>
+          </w:tcPr>
+          <w:p>
+            <w:r>
+              <w:rPr>
+                <w:sz w:val="20"/>
+                <w:szCs w:val="20"/>
+              </w:rPr>
+              <w:t xml:space="preserve">El programa del XIAO ESP32-S3: cámara, foto grande, OLED, sensor, botones, pitido y audio. Compila; sin probar en una placa.</w:t>
+            </w:r>
+          </w:p>
+        </w:tc>
+        <w:tc>
+          <w:tcPr>
+            <w:tcW w:type="dxa" w:w="2256"/>
+            <w:tcBorders>
+              <w:top w:val="single" w:color="B8C2CC" w:sz="4"/>
+              <w:left w:val="single" w:color="B8C2CC" w:sz="4"/>
+              <w:bottom w:val="single" w:color="B8C2CC" w:sz="4"/>
+              <w:right w:val="single" w:color="B8C2CC" w:sz="4"/>
+            </w:tcBorders>
+            <w:tcMar>
+              <w:top w:type="dxa" w:w="70"/>
+              <w:left w:type="dxa" w:w="110"/>
+              <w:bottom w:type="dxa" w:w="70"/>
+              <w:right w:type="dxa" w:w="110"/>
+            </w:tcMar>
+          </w:tcPr>
+          <w:p>
+            <w:r>
+              <w:rPr>
+                <w:sz w:val="20"/>
+                <w:szCs w:val="20"/>
+              </w:rPr>
+              <w:t xml:space="preserve">El hardware</w:t>
+            </w:r>
+          </w:p>
+        </w:tc>
+      </w:tr>
+      <w:tr>
+        <w:trPr>
+          <w:tblHeader w:val="off"/>
+        </w:trPr>
+        <w:tc>
+          <w:tcPr>
+            <w:tcW w:type="dxa" w:w="2257"/>
+            <w:tcBorders>
+              <w:top w:val="single" w:color="B8C2CC" w:sz="4"/>
+              <w:left w:val="single" w:color="B8C2CC" w:sz="4"/>
+              <w:bottom w:val="single" w:color="B8C2CC" w:sz="4"/>
+              <w:right w:val="single" w:color="B8C2CC" w:sz="4"/>
+            </w:tcBorders>
+            <w:tcMar>
+              <w:top w:type="dxa" w:w="70"/>
+              <w:left w:type="dxa" w:w="110"/>
+              <w:bottom w:type="dxa" w:w="70"/>
+              <w:right w:type="dxa" w:w="110"/>
+            </w:tcMar>
+          </w:tcPr>
+          <w:p>
+            <w:r>
+              <w:rPr>
+                <w:sz w:val="20"/>
+                <w:szCs w:val="20"/>
+              </w:rPr>
+              <w:t xml:space="preserve">Raspberry Pi</w:t>
+            </w:r>
+          </w:p>
+        </w:tc>
+        <w:tc>
+          <w:tcPr>
+            <w:tcW w:type="dxa" w:w="4513"/>
+            <w:tcBorders>
+              <w:top w:val="single" w:color="B8C2CC" w:sz="4"/>
+              <w:left w:val="single" w:color="B8C2CC" w:sz="4"/>
+              <w:bottom w:val="single" w:color="B8C2CC" w:sz="4"/>
+              <w:right w:val="single" w:color="B8C2CC" w:sz="4"/>
+            </w:tcBorders>
+            <w:tcMar>
+              <w:top w:type="dxa" w:w="70"/>
+              <w:left w:type="dxa" w:w="110"/>
+              <w:bottom w:type="dxa" w:w="70"/>
+              <w:right w:type="dxa" w:w="110"/>
+            </w:tcMar>
+          </w:tcPr>
+          <w:p>
+            <w:r>
+              <w:rPr>
+                <w:sz w:val="20"/>
+                <w:szCs w:val="20"/>
+              </w:rPr>
+              <w:t xml:space="preserve">Cómo correr el cerebro en una Pi 5, para usar las gafas sin la PC (</w:t>
+            </w:r>
+            <w:r>
+              <w:rPr>
+                <w:rFonts w:ascii="Consolas" w:cs="Consolas" w:eastAsia="Consolas" w:hAnsi="Consolas"/>
+                <w:sz w:val="18"/>
+                <w:szCs w:val="18"/>
+              </w:rPr>
+              <w:t xml:space="preserve">docs/raspberry.md</w:t>
+            </w:r>
+            <w:r>
+              <w:rPr>
+                <w:sz w:val="20"/>
+                <w:szCs w:val="20"/>
+              </w:rPr>
+              <w:t xml:space="preserve">).</w:t>
+            </w:r>
+          </w:p>
+        </w:tc>
+        <w:tc>
+          <w:tcPr>
+            <w:tcW w:type="dxa" w:w="2256"/>
+            <w:tcBorders>
+              <w:top w:val="single" w:color="B8C2CC" w:sz="4"/>
+              <w:left w:val="single" w:color="B8C2CC" w:sz="4"/>
+              <w:bottom w:val="single" w:color="B8C2CC" w:sz="4"/>
+              <w:right w:val="single" w:color="B8C2CC" w:sz="4"/>
+            </w:tcBorders>
+            <w:tcMar>
+              <w:top w:type="dxa" w:w="70"/>
+              <w:left w:type="dxa" w:w="110"/>
+              <w:bottom w:type="dxa" w:w="70"/>
+              <w:right w:type="dxa" w:w="110"/>
+            </w:tcMar>
+          </w:tcPr>
+          <w:p>
+            <w:r>
+              <w:rPr>
+                <w:sz w:val="20"/>
+                <w:szCs w:val="20"/>
+              </w:rPr>
+              <w:t xml:space="preserve">Una Pi 5</w:t>
+            </w:r>
+          </w:p>
+        </w:tc>
+      </w:tr>
+    </w:tbl>
+    <w:p>
+      <w:pPr>
+        <w:spacing w:after="0"/>
+      </w:pPr>
+      <w:r>
+        <w:rPr>
+          <w:sz w:val="12"/>
+          <w:szCs w:val="12"/>
+        </w:rPr>
+        <w:t xml:space="preserve"/>
+      </w:r>
+    </w:p>
+    <w:p>
+      <w:pPr>
+        <w:spacing w:after="140"/>
+      </w:pPr>
+      <w:r>
+        <w:t xml:space="preserve">Además, con DINOv2 bajado vota sólo él: los dos extractores hechos a mano no sumaban (91,2 % contra 91,3 %) y costaban tiempo. Sin DINOv2, votan ellos.</w:t>
+      </w:r>
+    </w:p>
+    <w:p>
+      <w:pPr>
+        <w:pStyle w:val="Heading1"/>
+        <w:keepNext/>
+      </w:pPr>
+      <w:r>
+        <w:t xml:space="preserve">15. Qué está probado y qué no</w:t>
       </w:r>
     </w:p>
     <w:tbl>
@@ -10774,7 +11825,64 @@
                 <w:sz w:val="20"/>
                 <w:szCs w:val="20"/>
               </w:rPr>
-              <w:t xml:space="preserve">El programa del microcontrolador, que no está escrito</w:t>
+              <w:t xml:space="preserve">El programa del microcontrolador en una placa (compila, pero no hay hardware)</w:t>
+            </w:r>
+          </w:p>
+        </w:tc>
+      </w:tr>
+      <w:tr>
+        <w:trPr>
+          <w:tblHeader w:val="off"/>
+        </w:trPr>
+        <w:tc>
+          <w:tcPr>
+            <w:tcW w:type="dxa" w:w="4513"/>
+            <w:tcBorders>
+              <w:top w:val="single" w:color="B8C2CC" w:sz="4"/>
+              <w:left w:val="single" w:color="B8C2CC" w:sz="4"/>
+              <w:bottom w:val="single" w:color="B8C2CC" w:sz="4"/>
+              <w:right w:val="single" w:color="B8C2CC" w:sz="4"/>
+            </w:tcBorders>
+            <w:tcMar>
+              <w:top w:type="dxa" w:w="70"/>
+              <w:left w:type="dxa" w:w="110"/>
+              <w:bottom w:type="dxa" w:w="70"/>
+              <w:right w:type="dxa" w:w="110"/>
+            </w:tcMar>
+          </w:tcPr>
+          <w:p>
+            <w:r>
+              <w:rPr>
+                <w:sz w:val="20"/>
+                <w:szCs w:val="20"/>
+              </w:rPr>
+              <w:t xml:space="preserve">Las funciones del 3 de octubre en el emulador, en un navegador de verdad</w:t>
+            </w:r>
+          </w:p>
+        </w:tc>
+        <w:tc>
+          <w:tcPr>
+            <w:tcW w:type="dxa" w:w="4513"/>
+            <w:tcBorders>
+              <w:top w:val="single" w:color="B8C2CC" w:sz="4"/>
+              <w:left w:val="single" w:color="B8C2CC" w:sz="4"/>
+              <w:bottom w:val="single" w:color="B8C2CC" w:sz="4"/>
+              <w:right w:val="single" w:color="B8C2CC" w:sz="4"/>
+            </w:tcBorders>
+            <w:tcMar>
+              <w:top w:type="dxa" w:w="70"/>
+              <w:left w:type="dxa" w:w="110"/>
+              <w:bottom w:type="dxa" w:w="70"/>
+              <w:right w:type="dxa" w:w="110"/>
+            </w:tcMar>
+          </w:tcPr>
+          <w:p>
+            <w:r>
+              <w:rPr>
+                <w:sz w:val="20"/>
+                <w:szCs w:val="20"/>
+              </w:rPr>
+              <w:t xml:space="preserve">Leer texto contra la API real y el aviso con vehículos reales</w:t>
             </w:r>
           </w:p>
         </w:tc>
@@ -10798,7 +11906,7 @@
         <w:keepNext/>
       </w:pPr>
       <w:r>
-        <w:t xml:space="preserve">15. Lo que sigue</w:t>
+        <w:t xml:space="preserve">16. Lo que sigue</w:t>
       </w:r>
     </w:p>
     <w:p>
@@ -10811,7 +11919,18 @@
         <w:spacing w:after="80"/>
       </w:pPr>
       <w:r>
-        <w:t xml:space="preserve">Medir el acierto con la webcam y objetos reales, y anotarlo.</w:t>
+        <w:t xml:space="preserve">Medir el acierto con la webcam y objetos reales con «Acertó / Se equivocó», y correr </w:t>
+      </w:r>
+      <w:r>
+        <w:rPr>
+          <w:rFonts w:ascii="Consolas" w:cs="Consolas" w:eastAsia="Consolas" w:hAnsi="Consolas"/>
+          <w:sz w:val="20"/>
+          <w:szCs w:val="20"/>
+        </w:rPr>
+        <w:t xml:space="preserve">npm run pruebas-reales</w:t>
+      </w:r>
+      <w:r>
+        <w:t xml:space="preserve">.</w:t>
       </w:r>
     </w:p>
     <w:p>
@@ -10824,7 +11943,7 @@
         <w:spacing w:after="80"/>
       </w:pPr>
       <w:r>
-        <w:t xml:space="preserve">Cargar una clave de DeepSeek o de Gemini y probar la conversación y la consulta de marca y modelo.</w:t>
+        <w:t xml:space="preserve">Cargar una clave de DeepSeek o de Gemini y probar la conversación, la consulta de marca y modelo y leer texto.</w:t>
       </w:r>
     </w:p>
     <w:p>
@@ -10837,7 +11956,7 @@
         <w:spacing w:after="80"/>
       </w:pPr>
       <w:r>
-        <w:t xml:space="preserve">Probar la distancia y la velocidad en la calle, y calibrar el campo de visión de la cámara.</w:t>
+        <w:t xml:space="preserve">Comparar las guías de primeros auxilios con la guía oficial de Cruz Roja Argentina.</w:t>
       </w:r>
     </w:p>
     <w:p>
@@ -10850,7 +11969,7 @@
         <w:spacing w:after="80"/>
       </w:pPr>
       <w:r>
-        <w:t xml:space="preserve">Comprar el XIAO y la pantalla; escribir el programa del microcontrolador con el mismo protocolo.</w:t>
+        <w:t xml:space="preserve">Probar la distancia, la velocidad y el aviso en la calle, y calibrar el campo de visión de la cámara.</w:t>
       </w:r>
     </w:p>
     <w:p>
@@ -10863,7 +11982,18 @@
         <w:spacing w:after="80"/>
       </w:pPr>
       <w:r>
-        <w:t xml:space="preserve">Armar la óptica y ajustar el foco; imprimir el marco.</w:t>
+        <w:t xml:space="preserve">Comprar el XIAO, la pantalla y el sensor; cargar el programa de </w:t>
+      </w:r>
+      <w:r>
+        <w:rPr>
+          <w:rFonts w:ascii="Consolas" w:cs="Consolas" w:eastAsia="Consolas" w:hAnsi="Consolas"/>
+          <w:sz w:val="20"/>
+          <w:szCs w:val="20"/>
+        </w:rPr>
+        <w:t xml:space="preserve">firmware/gafas_xiao</w:t>
+      </w:r>
+      <w:r>
+        <w:t xml:space="preserve"> y probarlo.</w:t>
       </w:r>
     </w:p>
     <w:p>
@@ -10876,7 +12006,31 @@
         <w:spacing w:after="80"/>
       </w:pPr>
       <w:r>
-        <w:t xml:space="preserve">Pasar el cerebro a un servidor, para usar las gafas fuera de casa. El celular es un iPhone y ahí no puede correr.</w:t>
+        <w:t xml:space="preserve">Armar la óptica y ajustar el foco; imprimir el marco.</w:t>
+      </w:r>
+    </w:p>
+    <w:p>
+      <w:pPr>
+        <w:pStyle w:val="ListParagraph"/>
+        <w:numPr>
+          <w:ilvl w:val="0"/>
+          <w:numId w:val="4"/>
+        </w:numPr>
+        <w:spacing w:after="80"/>
+      </w:pPr>
+      <w:r>
+        <w:t xml:space="preserve">Pasar el cerebro a una Raspberry Pi 5 (</w:t>
+      </w:r>
+      <w:r>
+        <w:rPr>
+          <w:rFonts w:ascii="Consolas" w:cs="Consolas" w:eastAsia="Consolas" w:hAnsi="Consolas"/>
+          <w:sz w:val="20"/>
+          <w:szCs w:val="20"/>
+        </w:rPr>
+        <w:t xml:space="preserve">docs/raspberry.md</w:t>
+      </w:r>
+      <w:r>
+        <w:t xml:space="preserve">) y medir si le da la velocidad.</w:t>
       </w:r>
     </w:p>
     <w:p>

</xml_diff>

<commit_message>
Arreglar lo que falló al probar la décima pasada en la PC
- npm test corre con Node 20 y con Node 22 (herramientas/correr_pruebas.js):
  la rama usaba un comodín que Node 20 no expande y no encontraba ninguna prueba.
- Marca y modelo y leer texto prueban con un modelo de reserva de Gemini
  (gemini-3.5-flash-lite) si el principal está saturado o tarda más de 12 s,
  y el error que se muestra se puede leer. Con gemini-3.8-flash contestando
  503, leer texto mostraba el JSON crudo del error en la pantalla.
- medir_objeto: el tamaño se pide sin argumentos; material y forma son sólo
  para el peso. Por voz, MIIA pedía el material antes de medir.

Probado contra Gemini de verdad por el cerebro: voz, herramientas, guías,
memoria de objetos, leer y traducir texto, marca y modelo y medir.

Co-Authored-By: Claude Opus 5.5 <noreply@anthropic.com>
</commit_message>
<xml_diff>
--- a/docs/Gafas MIIA - Documentación y planos.docx
+++ b/docs/Gafas MIIA - Documentación y planos.docx
@@ -587,7 +587,7 @@
                 <w:sz w:val="20"/>
                 <w:szCs w:val="20"/>
               </w:rPr>
-              <w:t xml:space="preserve">Escrito para dos LLM (DeepSeek y Gemini), </w:t>
+              <w:t xml:space="preserve">Con Gemini, probado de verdad: contesta con audio, usa las herramientas y devuelve la ficha. Con DeepSeek, escrito y </w:t>
             </w:r>
             <w:r>
               <w:rPr>
@@ -603,7 +603,7 @@
                 <w:sz w:val="20"/>
                 <w:szCs w:val="20"/>
               </w:rPr>
-              <w:t xml:space="preserve"> contra ninguno: falta la clave</w:t>
+              <w:t xml:space="preserve">: la cuenta no tiene saldo</w:t>
             </w:r>
           </w:p>
         </w:tc>
@@ -11540,7 +11540,64 @@
                 <w:sz w:val="20"/>
                 <w:szCs w:val="20"/>
               </w:rPr>
-              <w:t xml:space="preserve">La conversación y la consulta de marca y modelo contra DeepSeek o Gemini</w:t>
+              <w:t xml:space="preserve">El micrófono y el parlante reales con la voz</w:t>
+            </w:r>
+          </w:p>
+        </w:tc>
+      </w:tr>
+      <w:tr>
+        <w:trPr>
+          <w:tblHeader w:val="off"/>
+        </w:trPr>
+        <w:tc>
+          <w:tcPr>
+            <w:tcW w:type="dxa" w:w="4513"/>
+            <w:tcBorders>
+              <w:top w:val="single" w:color="B8C2CC" w:sz="4"/>
+              <w:left w:val="single" w:color="B8C2CC" w:sz="4"/>
+              <w:bottom w:val="single" w:color="B8C2CC" w:sz="4"/>
+              <w:right w:val="single" w:color="B8C2CC" w:sz="4"/>
+            </w:tcBorders>
+            <w:tcMar>
+              <w:top w:type="dxa" w:w="70"/>
+              <w:left w:type="dxa" w:w="110"/>
+              <w:bottom w:type="dxa" w:w="70"/>
+              <w:right w:type="dxa" w:w="110"/>
+            </w:tcMar>
+          </w:tcPr>
+          <w:p>
+            <w:r>
+              <w:rPr>
+                <w:sz w:val="20"/>
+                <w:szCs w:val="20"/>
+              </w:rPr>
+              <w:t xml:space="preserve">La voz y marca y modelo contra Gemini de verdad</w:t>
+            </w:r>
+          </w:p>
+        </w:tc>
+        <w:tc>
+          <w:tcPr>
+            <w:tcW w:type="dxa" w:w="4513"/>
+            <w:tcBorders>
+              <w:top w:val="single" w:color="B8C2CC" w:sz="4"/>
+              <w:left w:val="single" w:color="B8C2CC" w:sz="4"/>
+              <w:bottom w:val="single" w:color="B8C2CC" w:sz="4"/>
+              <w:right w:val="single" w:color="B8C2CC" w:sz="4"/>
+            </w:tcBorders>
+            <w:tcMar>
+              <w:top w:type="dxa" w:w="70"/>
+              <w:left w:type="dxa" w:w="110"/>
+              <w:bottom w:type="dxa" w:w="70"/>
+              <w:right w:type="dxa" w:w="110"/>
+            </w:tcMar>
+          </w:tcPr>
+          <w:p>
+            <w:r>
+              <w:rPr>
+                <w:sz w:val="20"/>
+                <w:szCs w:val="20"/>
+              </w:rPr>
+              <w:t xml:space="preserve">La conversación y marca y modelo contra DeepSeek (sin saldo)</w:t>
             </w:r>
           </w:p>
         </w:tc>
@@ -11943,7 +12000,7 @@
         <w:spacing w:after="80"/>
       </w:pPr>
       <w:r>
-        <w:t xml:space="preserve">Cargar una clave de DeepSeek o de Gemini y probar la conversación, la consulta de marca y modelo y leer texto.</w:t>
+        <w:t xml:space="preserve">Probar la voz con el micrófono de verdad, y cargar saldo en DeepSeek para probarlo.</w:t>
       </w:r>
     </w:p>
     <w:p>

</xml_diff>